<commit_message>
AM Studio: Les mots tab per task, subtler Spot-the-error items, guide updates
Co-Authored-By: Claude Sonnet 5.5 <noreply@anthropic.com>
Claude-Session: https://claude.ai/code/session_01S5rYTdm2Guhk5rucFAEyLg
</commit_message>
<xml_diff>
--- a/Word documents/AP_IGCSE_User_Guide.docx
+++ b/Word documents/AP_IGCSE_User_Guide.docx
@@ -19464,15 +19464,87 @@
           <w:sz w:val="22"/>
           <w:szCs w:val="22"/>
         </w:rPr>
-        <w:t xml:space="preserve">Gaps:</w:t>
-      </w:r>
-      <w:r>
-        <w:rPr>
-          <w:rFonts w:ascii="Arial" w:cs="Arial" w:eastAsia="Arial" w:hAnsi="Arial"/>
-          <w:sz w:val="22"/>
-          <w:szCs w:val="22"/>
-        </w:rPr>
-        <w:t xml:space="preserve"> a word or short phrase is missing from a sentence. Type it (the hint says what kind of word it is) and press Check or Enter.</w:t>
+        <w:t xml:space="preserve">Les mots:</w:t>
+      </w:r>
+      <w:r>
+        <w:rPr>
+          <w:rFonts w:ascii="Arial" w:cs="Arial" w:eastAsia="Arial" w:hAnsi="Arial"/>
+          <w:sz w:val="22"/>
+          <w:szCs w:val="22"/>
+        </w:rPr>
+        <w:t xml:space="preserve"> for each task (for example “Describe buildings and facilities in your town”), the 10 to 12 key words and phrases you need, then a few frames to reuse, taken from the approved sentences. In a frame, </w:t>
+      </w:r>
+      <w:r>
+        <w:rPr>
+          <w:rFonts w:ascii="Arial" w:cs="Arial" w:eastAsia="Arial" w:hAnsi="Arial"/>
+          <w:b/>
+          <w:bCs/>
+          <w:sz w:val="22"/>
+          <w:szCs w:val="22"/>
+        </w:rPr>
+        <w:t xml:space="preserve">X</w:t>
+      </w:r>
+      <w:r>
+        <w:rPr>
+          <w:rFonts w:ascii="Arial" w:cs="Arial" w:eastAsia="Arial" w:hAnsi="Arial"/>
+          <w:sz w:val="22"/>
+          <w:szCs w:val="22"/>
+        </w:rPr>
+        <w:t xml:space="preserve"> and </w:t>
+      </w:r>
+      <w:r>
+        <w:rPr>
+          <w:rFonts w:ascii="Arial" w:cs="Arial" w:eastAsia="Arial" w:hAnsi="Arial"/>
+          <w:b/>
+          <w:bCs/>
+          <w:sz w:val="22"/>
+          <w:szCs w:val="22"/>
+        </w:rPr>
+        <w:t xml:space="preserve">Y</w:t>
+      </w:r>
+      <w:r>
+        <w:rPr>
+          <w:rFonts w:ascii="Arial" w:cs="Arial" w:eastAsia="Arial" w:hAnsi="Arial"/>
+          <w:sz w:val="22"/>
+          <w:szCs w:val="22"/>
+        </w:rPr>
+        <w:t xml:space="preserve"> are things you add, </w:t>
+      </w:r>
+      <w:r>
+        <w:rPr>
+          <w:rFonts w:ascii="Arial" w:cs="Arial" w:eastAsia="Arial" w:hAnsi="Arial"/>
+          <w:b/>
+          <w:bCs/>
+          <w:sz w:val="22"/>
+          <w:szCs w:val="22"/>
+        </w:rPr>
+        <w:t xml:space="preserve">INF</w:t>
+      </w:r>
+      <w:r>
+        <w:rPr>
+          <w:rFonts w:ascii="Arial" w:cs="Arial" w:eastAsia="Arial" w:hAnsi="Arial"/>
+          <w:sz w:val="22"/>
+          <w:szCs w:val="22"/>
+        </w:rPr>
+        <w:t xml:space="preserve"> is an infinitive and </w:t>
+      </w:r>
+      <w:r>
+        <w:rPr>
+          <w:rFonts w:ascii="Arial" w:cs="Arial" w:eastAsia="Arial" w:hAnsi="Arial"/>
+          <w:b/>
+          <w:bCs/>
+          <w:sz w:val="22"/>
+          <w:szCs w:val="22"/>
+        </w:rPr>
+        <w:t xml:space="preserve">SUBJ</w:t>
+      </w:r>
+      <w:r>
+        <w:rPr>
+          <w:rFonts w:ascii="Arial" w:cs="Arial" w:eastAsia="Arial" w:hAnsi="Arial"/>
+          <w:sz w:val="22"/>
+          <w:szCs w:val="22"/>
+        </w:rPr>
+        <w:t xml:space="preserve"> is a subjunctive clause. 🔊 plays a phrase; click a row to see the approved sentence it comes from. Nothing is marked: read it, listen, say it aloud, then go to the drills.</w:t>
       </w:r>
     </w:p>
     <w:p>
@@ -19492,6 +19564,34 @@
           <w:sz w:val="22"/>
           <w:szCs w:val="22"/>
         </w:rPr>
+        <w:t xml:space="preserve">Gaps:</w:t>
+      </w:r>
+      <w:r>
+        <w:rPr>
+          <w:rFonts w:ascii="Arial" w:cs="Arial" w:eastAsia="Arial" w:hAnsi="Arial"/>
+          <w:sz w:val="22"/>
+          <w:szCs w:val="22"/>
+        </w:rPr>
+        <w:t xml:space="preserve"> a word or short phrase is missing from a sentence. Type it (the hint says what kind of word it is) and press Check or Enter.</w:t>
+      </w:r>
+    </w:p>
+    <w:p>
+      <w:pPr>
+        <w:pStyle w:val="ListParagraph"/>
+        <w:numPr>
+          <w:ilvl w:val="0"/>
+          <w:numId w:val="2"/>
+        </w:numPr>
+        <w:spacing w:after="60" w:line="276"/>
+      </w:pPr>
+      <w:r>
+        <w:rPr>
+          <w:rFonts w:ascii="Arial" w:cs="Arial" w:eastAsia="Arial" w:hAnsi="Arial"/>
+          <w:b/>
+          <w:bCs/>
+          <w:sz w:val="22"/>
+          <w:szCs w:val="22"/>
+        </w:rPr>
         <w:t xml:space="preserve">Spot the error:</w:t>
       </w:r>
       <w:r>
@@ -19500,7 +19600,7 @@
           <w:sz w:val="22"/>
           <w:szCs w:val="22"/>
         </w:rPr>
-        <w:t xml:space="preserve"> one word in the sentence is wrong. Click it, then type the correction. When something is missing, click a word next to the place where it should be, then type what is missing. After each item you see the rule.</w:t>
+        <w:t xml:space="preserve"> one word in the sentence is wrong. Click it, then type the correction. When something is missing, click a word next to the place where it should be, then type what is missing. After each item you see the rule. The mistakes are the subtle ones: moods and tenses, pronouns, relative pronouns, prepositions.</w:t>
       </w:r>
     </w:p>
     <w:p>

</xml_diff>

<commit_message>
AM Studio: tile 2 on home screen, French voice fix, guide wording
Co-Authored-By: Claude Sonnet 5.5 <noreply@anthropic.com>
Claude-Session: https://claude.ai/code/session_01S5rYTdm2Guhk5rucFAEyLg
</commit_message>
<xml_diff>
--- a/Word documents/AP_IGCSE_User_Guide.docx
+++ b/Word documents/AP_IGCSE_User_Guide.docx
@@ -18384,7 +18384,7 @@
           <w:sz w:val="22"/>
           <w:szCs w:val="22"/>
         </w:rPr>
-        <w:t xml:space="preserve">2 ✍️ Practice Sentences (Then test yourself)</w:t>
+        <w:t xml:space="preserve">2 🎓 Approved Material Studio (Master it, French)</w:t>
       </w:r>
       <w:r>
         <w:rPr>
@@ -18402,15 +18402,15 @@
           <w:sz w:val="22"/>
           <w:szCs w:val="22"/>
         </w:rPr>
-        <w:t xml:space="preserve">3 🎓 Approved Material Studio (Master it, French)</w:t>
-      </w:r>
-      <w:r>
-        <w:rPr>
-          <w:rFonts w:ascii="Arial" w:cs="Arial" w:eastAsia="Arial" w:hAnsi="Arial"/>
-          <w:sz w:val="22"/>
-          <w:szCs w:val="22"/>
-        </w:rPr>
-        <w:t xml:space="preserve">. The first two switch what the rest of the home screen works on. The third opens the Studio (see below) and has a </w:t>
+        <w:t xml:space="preserve">3 ✍️ Practice Sentences (Then test yourself)</w:t>
+      </w:r>
+      <w:r>
+        <w:rPr>
+          <w:rFonts w:ascii="Arial" w:cs="Arial" w:eastAsia="Arial" w:hAnsi="Arial"/>
+          <w:sz w:val="22"/>
+          <w:szCs w:val="22"/>
+        </w:rPr>
+        <w:t xml:space="preserve">. Tiles 1 and 3 switch what the rest of the home screen works on. Tile 2 opens the Studio (see below) and has a </w:t>
       </w:r>
       <w:r>
         <w:rPr>
@@ -19198,7 +19198,7 @@
           <w:sz w:val="22"/>
           <w:szCs w:val="22"/>
         </w:rPr>
-        <w:t xml:space="preserve"> becoming a real master of the Approved Material, section by section. Every exercise is built from the approved sentences themselves, so you are always working on exactly the wording you will use. Open it with the third tile on the home screen. It covers French only for now.</w:t>
+        <w:t xml:space="preserve"> becoming a real master of the Approved Material, section by section. Every exercise is built from the approved sentences themselves, so you are always working on exactly the wording you will use. Open it with the second tile on the home screen. It covers French only for now.</w:t>
       </w:r>
     </w:p>
     <w:p>

</xml_diff>

<commit_message>
Approved Material Studio: all oral except Rebuild, full title in header, guide updates
Co-Authored-By: Claude Sonnet 5.5 <noreply@anthropic.com>
Claude-Session: https://claude.ai/code/session_01S5rYTdm2Guhk5rucFAEyLg
</commit_message>
<xml_diff>
--- a/Word documents/AP_IGCSE_User_Guide.docx
+++ b/Word documents/AP_IGCSE_User_Guide.docx
@@ -19572,7 +19572,61 @@
           <w:sz w:val="22"/>
           <w:szCs w:val="22"/>
         </w:rPr>
-        <w:t xml:space="preserve"> a word or short phrase is missing from a sentence. Type it (the hint says what kind of word it is) and press Check or Enter.</w:t>
+        <w:t xml:space="preserve"> a word or short phrase is missing from a sentence. Say it aloud (the hint says what kind of word it is), press </w:t>
+      </w:r>
+      <w:r>
+        <w:rPr>
+          <w:rFonts w:ascii="Arial" w:cs="Arial" w:eastAsia="Arial" w:hAnsi="Arial"/>
+          <w:b/>
+          <w:bCs/>
+          <w:sz w:val="22"/>
+          <w:szCs w:val="22"/>
+        </w:rPr>
+        <w:t xml:space="preserve">Show the answer</w:t>
+      </w:r>
+      <w:r>
+        <w:rPr>
+          <w:rFonts w:ascii="Arial" w:cs="Arial" w:eastAsia="Arial" w:hAnsi="Arial"/>
+          <w:sz w:val="22"/>
+          <w:szCs w:val="22"/>
+        </w:rPr>
+        <w:t xml:space="preserve">, then mark yourself: </w:t>
+      </w:r>
+      <w:r>
+        <w:rPr>
+          <w:rFonts w:ascii="Arial" w:cs="Arial" w:eastAsia="Arial" w:hAnsi="Arial"/>
+          <w:b/>
+          <w:bCs/>
+          <w:sz w:val="22"/>
+          <w:szCs w:val="22"/>
+        </w:rPr>
+        <w:t xml:space="preserve">Perfect</w:t>
+      </w:r>
+      <w:r>
+        <w:rPr>
+          <w:rFonts w:ascii="Arial" w:cs="Arial" w:eastAsia="Arial" w:hAnsi="Arial"/>
+          <w:sz w:val="22"/>
+          <w:szCs w:val="22"/>
+        </w:rPr>
+        <w:t xml:space="preserve"> only if you said exactly the approved wording, otherwise </w:t>
+      </w:r>
+      <w:r>
+        <w:rPr>
+          <w:rFonts w:ascii="Arial" w:cs="Arial" w:eastAsia="Arial" w:hAnsi="Arial"/>
+          <w:b/>
+          <w:bCs/>
+          <w:sz w:val="22"/>
+          <w:szCs w:val="22"/>
+        </w:rPr>
+        <w:t xml:space="preserve">Not yet</w:t>
+      </w:r>
+      <w:r>
+        <w:rPr>
+          <w:rFonts w:ascii="Arial" w:cs="Arial" w:eastAsia="Arial" w:hAnsi="Arial"/>
+          <w:sz w:val="22"/>
+          <w:szCs w:val="22"/>
+        </w:rPr>
+        <w:t xml:space="preserve">.</w:t>
       </w:r>
     </w:p>
     <w:p>
@@ -19600,7 +19654,25 @@
           <w:sz w:val="22"/>
           <w:szCs w:val="22"/>
         </w:rPr>
-        <w:t xml:space="preserve"> one word in the sentence is wrong. Click it, then type the correction. When something is missing, click a word next to the place where it should be, then type what is missing. After each item you see the rule. The mistakes are the subtle ones: moods and tenses, pronouns, relative pronouns, prepositions.</w:t>
+        <w:t xml:space="preserve"> one word in the sentence is wrong. Click it. When something is missing, click a word next to the place where it should be. Then say the correction aloud, press </w:t>
+      </w:r>
+      <w:r>
+        <w:rPr>
+          <w:rFonts w:ascii="Arial" w:cs="Arial" w:eastAsia="Arial" w:hAnsi="Arial"/>
+          <w:b/>
+          <w:bCs/>
+          <w:sz w:val="22"/>
+          <w:szCs w:val="22"/>
+        </w:rPr>
+        <w:t xml:space="preserve">Show the correction</w:t>
+      </w:r>
+      <w:r>
+        <w:rPr>
+          <w:rFonts w:ascii="Arial" w:cs="Arial" w:eastAsia="Arial" w:hAnsi="Arial"/>
+          <w:sz w:val="22"/>
+          <w:szCs w:val="22"/>
+        </w:rPr>
+        <w:t xml:space="preserve"> and mark yourself. After each item you see the rule. The mistakes are the subtle ones: moods and tenses, pronouns, relative pronouns, prepositions. Finding the faulty word earns half a mark; saying the correction exactly earns the other half.</w:t>
       </w:r>
     </w:p>
     <w:p>
@@ -19628,7 +19700,7 @@
           <w:sz w:val="22"/>
           <w:szCs w:val="22"/>
         </w:rPr>
-        <w:t xml:space="preserve"> the sentence is cut into groups of words. Click them in the right order, then Check. Click a word in the top box to take it back.</w:t>
+        <w:t xml:space="preserve"> the sentence is cut into groups of words. Click them in the right order, then Check. Click a word in the top box to take it back. This is the only exercise the Studio marks for you: the order must be exactly right.</w:t>
       </w:r>
     </w:p>
     <w:p>
@@ -19656,7 +19728,25 @@
           <w:sz w:val="22"/>
           <w:szCs w:val="22"/>
         </w:rPr>
-        <w:t xml:space="preserve"> an English phrase from the approved sentences; type the French.</w:t>
+        <w:t xml:space="preserve"> an English phrase from the approved sentences; say the French aloud, press </w:t>
+      </w:r>
+      <w:r>
+        <w:rPr>
+          <w:rFonts w:ascii="Arial" w:cs="Arial" w:eastAsia="Arial" w:hAnsi="Arial"/>
+          <w:b/>
+          <w:bCs/>
+          <w:sz w:val="22"/>
+          <w:szCs w:val="22"/>
+        </w:rPr>
+        <w:t xml:space="preserve">Show the French</w:t>
+      </w:r>
+      <w:r>
+        <w:rPr>
+          <w:rFonts w:ascii="Arial" w:cs="Arial" w:eastAsia="Arial" w:hAnsi="Arial"/>
+          <w:sz w:val="22"/>
+          <w:szCs w:val="22"/>
+        </w:rPr>
+        <w:t xml:space="preserve"> and mark yourself.</w:t>
       </w:r>
     </w:p>
     <w:p>
@@ -19684,7 +19774,25 @@
           <w:sz w:val="22"/>
           <w:szCs w:val="22"/>
         </w:rPr>
-        <w:t xml:space="preserve"> a longer English sentence with some parts in bold; type the French for each bold part.</w:t>
+        <w:t xml:space="preserve"> a longer English sentence with some parts in bold; say the French for each bold part aloud, press </w:t>
+      </w:r>
+      <w:r>
+        <w:rPr>
+          <w:rFonts w:ascii="Arial" w:cs="Arial" w:eastAsia="Arial" w:hAnsi="Arial"/>
+          <w:b/>
+          <w:bCs/>
+          <w:sz w:val="22"/>
+          <w:szCs w:val="22"/>
+        </w:rPr>
+        <w:t xml:space="preserve">Show the French</w:t>
+      </w:r>
+      <w:r>
+        <w:rPr>
+          <w:rFonts w:ascii="Arial" w:cs="Arial" w:eastAsia="Arial" w:hAnsi="Arial"/>
+          <w:sz w:val="22"/>
+          <w:szCs w:val="22"/>
+        </w:rPr>
+        <w:t xml:space="preserve"> and mark yourself.</w:t>
       </w:r>
     </w:p>
     <w:p>
@@ -19732,15 +19840,51 @@
           <w:sz w:val="22"/>
           <w:szCs w:val="22"/>
         </w:rPr>
-        <w:t xml:space="preserve">Marking is strict:</w:t>
-      </w:r>
-      <w:r>
-        <w:rPr>
-          <w:rFonts w:ascii="Arial" w:cs="Arial" w:eastAsia="Arial" w:hAnsi="Arial"/>
-          <w:sz w:val="22"/>
-          <w:szCs w:val="22"/>
-        </w:rPr>
-        <w:t xml:space="preserve"> an answer scores only if it matches the approved wording exactly, accents and capital letters included. If only an accent or a capital letter is wrong, the Studio tells you, but there is no mark. The only thing ignored is the style of apostrophe (’ or '), because a keyboard may type either. In Spot the error, finding the faulty word and then correcting it exactly earns the full mark; finding it but not correcting it earns half. Best scores are kept on this device. Nothing is sent to AP.</w:t>
+        <w:t xml:space="preserve">Nothing is typed:</w:t>
+      </w:r>
+      <w:r>
+        <w:rPr>
+          <w:rFonts w:ascii="Arial" w:cs="Arial" w:eastAsia="Arial" w:hAnsi="Arial"/>
+          <w:sz w:val="22"/>
+          <w:szCs w:val="22"/>
+        </w:rPr>
+        <w:t xml:space="preserve"> you say the answers aloud and mark yourself honestly. </w:t>
+      </w:r>
+      <w:r>
+        <w:rPr>
+          <w:rFonts w:ascii="Arial" w:cs="Arial" w:eastAsia="Arial" w:hAnsi="Arial"/>
+          <w:b/>
+          <w:bCs/>
+          <w:sz w:val="22"/>
+          <w:szCs w:val="22"/>
+        </w:rPr>
+        <w:t xml:space="preserve">Perfect</w:t>
+      </w:r>
+      <w:r>
+        <w:rPr>
+          <w:rFonts w:ascii="Arial" w:cs="Arial" w:eastAsia="Arial" w:hAnsi="Arial"/>
+          <w:sz w:val="22"/>
+          <w:szCs w:val="22"/>
+        </w:rPr>
+        <w:t xml:space="preserve"> means you said exactly the approved wording; anything less is </w:t>
+      </w:r>
+      <w:r>
+        <w:rPr>
+          <w:rFonts w:ascii="Arial" w:cs="Arial" w:eastAsia="Arial" w:hAnsi="Arial"/>
+          <w:b/>
+          <w:bCs/>
+          <w:sz w:val="22"/>
+          <w:szCs w:val="22"/>
+        </w:rPr>
+        <w:t xml:space="preserve">Not yet</w:t>
+      </w:r>
+      <w:r>
+        <w:rPr>
+          <w:rFonts w:ascii="Arial" w:cs="Arial" w:eastAsia="Arial" w:hAnsi="Arial"/>
+          <w:sz w:val="22"/>
+          <w:szCs w:val="22"/>
+        </w:rPr>
+        <w:t xml:space="preserve">. Keys: Space or Enter shows the answer; ← or 1 for Not yet, → or 2 for Perfect. Best scores are kept on this device. Nothing is sent to AP.</w:t>
       </w:r>
     </w:p>
     <w:p>
@@ -19768,7 +19912,7 @@
           <w:sz w:val="22"/>
           <w:szCs w:val="22"/>
         </w:rPr>
-        <w:t xml:space="preserve"> (top right) makes the type larger for a class. Enter checks an answer and moves on to the next item.</w:t>
+        <w:t xml:space="preserve"> (top right) makes the type larger for a class. Space or Enter shows the answer and Enter moves on to the next item.</w:t>
       </w:r>
     </w:p>
     <w:p>

</xml_diff>

<commit_message>
Approved Material Studio: no scores, AP Timed Spot Test on shared engine, AP Structures in Les mots, guides updated
Co-Authored-By: Claude Sonnet 5.5 <noreply@anthropic.com>
Claude-Session: https://claude.ai/code/session_01S5rYTdm2Guhk5rucFAEyLg
</commit_message>
<xml_diff>
--- a/Word documents/AP_IGCSE_User_Guide.docx
+++ b/Word documents/AP_IGCSE_User_Guide.docx
@@ -19226,7 +19226,7 @@
           <w:sz w:val="22"/>
           <w:szCs w:val="22"/>
         </w:rPr>
-        <w:t xml:space="preserve"> a tile for each of the 19 sections (with five dots that fill as you finish each drill at least once on this device) and </w:t>
+        <w:t xml:space="preserve"> a tile for each of the 19 sections and </w:t>
       </w:r>
       <w:r>
         <w:rPr>
@@ -19244,7 +19244,7 @@
           <w:sz w:val="22"/>
           <w:szCs w:val="22"/>
         </w:rPr>
-        <w:t xml:space="preserve"> for a random round across everything.</w:t>
+        <w:t xml:space="preserve"> for a random round across everything. Nothing in the Studio is scored.</w:t>
       </w:r>
     </w:p>
     <w:p>
@@ -19472,7 +19472,25 @@
           <w:sz w:val="22"/>
           <w:szCs w:val="22"/>
         </w:rPr>
-        <w:t xml:space="preserve"> for each task (for example “Describe buildings and facilities in your town”), the 10 to 12 key words and phrases you need, then a few frames to reuse, taken from the approved sentences. In a frame, </w:t>
+        <w:t xml:space="preserve"> for each task (for example “Describe buildings and facilities in your town”), the 10 to 12 key words and phrases you need, then </w:t>
+      </w:r>
+      <w:r>
+        <w:rPr>
+          <w:rFonts w:ascii="Arial" w:cs="Arial" w:eastAsia="Arial" w:hAnsi="Arial"/>
+          <w:b/>
+          <w:bCs/>
+          <w:sz w:val="22"/>
+          <w:szCs w:val="22"/>
+        </w:rPr>
+        <w:t xml:space="preserve">AP Structures</w:t>
+      </w:r>
+      <w:r>
+        <w:rPr>
+          <w:rFonts w:ascii="Arial" w:cs="Arial" w:eastAsia="Arial" w:hAnsi="Arial"/>
+          <w:sz w:val="22"/>
+          <w:szCs w:val="22"/>
+        </w:rPr>
+        <w:t xml:space="preserve"> from your AP Structures book that fit the topic and let you say more (for example opinion frames, past-tense story frames or future phrases), then a few frames to reuse from the approved sentences. In a frame, </w:t>
       </w:r>
       <w:r>
         <w:rPr>
@@ -19526,7 +19544,25 @@
           <w:sz w:val="22"/>
           <w:szCs w:val="22"/>
         </w:rPr>
-        <w:t xml:space="preserve"> is an infinitive and </w:t>
+        <w:t xml:space="preserve"> is an infinitive, </w:t>
+      </w:r>
+      <w:r>
+        <w:rPr>
+          <w:rFonts w:ascii="Arial" w:cs="Arial" w:eastAsia="Arial" w:hAnsi="Arial"/>
+          <w:b/>
+          <w:bCs/>
+          <w:sz w:val="22"/>
+          <w:szCs w:val="22"/>
+        </w:rPr>
+        <w:t xml:space="preserve">ADJ</w:t>
+      </w:r>
+      <w:r>
+        <w:rPr>
+          <w:rFonts w:ascii="Arial" w:cs="Arial" w:eastAsia="Arial" w:hAnsi="Arial"/>
+          <w:sz w:val="22"/>
+          <w:szCs w:val="22"/>
+        </w:rPr>
+        <w:t xml:space="preserve"> is an adjective and </w:t>
       </w:r>
       <w:r>
         <w:rPr>
@@ -19544,7 +19580,7 @@
           <w:sz w:val="22"/>
           <w:szCs w:val="22"/>
         </w:rPr>
-        <w:t xml:space="preserve"> is a subjunctive clause. 🔊 plays a phrase; click a row to see the approved sentence it comes from. Nothing is marked: read it, listen, say it aloud, then go to the drills.</w:t>
+        <w:t xml:space="preserve"> is a subjunctive clause. 🔊 plays a phrase; click a word or frame row to see the approved sentence it comes from. Nothing is marked: read it, listen, say it aloud, then go to the drills.</w:t>
       </w:r>
     </w:p>
     <w:p>
@@ -19590,35 +19626,17 @@
           <w:sz w:val="22"/>
           <w:szCs w:val="22"/>
         </w:rPr>
-        <w:t xml:space="preserve">, then mark yourself: </w:t>
-      </w:r>
-      <w:r>
-        <w:rPr>
-          <w:rFonts w:ascii="Arial" w:cs="Arial" w:eastAsia="Arial" w:hAnsi="Arial"/>
-          <w:b/>
-          <w:bCs/>
-          <w:sz w:val="22"/>
-          <w:szCs w:val="22"/>
-        </w:rPr>
-        <w:t xml:space="preserve">Perfect</w:t>
-      </w:r>
-      <w:r>
-        <w:rPr>
-          <w:rFonts w:ascii="Arial" w:cs="Arial" w:eastAsia="Arial" w:hAnsi="Arial"/>
-          <w:sz w:val="22"/>
-          <w:szCs w:val="22"/>
-        </w:rPr>
-        <w:t xml:space="preserve"> only if you said exactly the approved wording, otherwise </w:t>
-      </w:r>
-      <w:r>
-        <w:rPr>
-          <w:rFonts w:ascii="Arial" w:cs="Arial" w:eastAsia="Arial" w:hAnsi="Arial"/>
-          <w:b/>
-          <w:bCs/>
-          <w:sz w:val="22"/>
-          <w:szCs w:val="22"/>
-        </w:rPr>
-        <w:t xml:space="preserve">Not yet</w:t>
+        <w:t xml:space="preserve">, then </w:t>
+      </w:r>
+      <w:r>
+        <w:rPr>
+          <w:rFonts w:ascii="Arial" w:cs="Arial" w:eastAsia="Arial" w:hAnsi="Arial"/>
+          <w:b/>
+          <w:bCs/>
+          <w:sz w:val="22"/>
+          <w:szCs w:val="22"/>
+        </w:rPr>
+        <w:t xml:space="preserve">Next</w:t>
       </w:r>
       <w:r>
         <w:rPr>
@@ -19654,7 +19672,7 @@
           <w:sz w:val="22"/>
           <w:szCs w:val="22"/>
         </w:rPr>
-        <w:t xml:space="preserve"> one word in the sentence is wrong. Click it. When something is missing, click a word next to the place where it should be. Then say the correction aloud, press </w:t>
+        <w:t xml:space="preserve"> one word in the sentence is wrong. Click it. When something is missing, click a word next to the place where it should be. Then say the correction aloud and press </w:t>
       </w:r>
       <w:r>
         <w:rPr>
@@ -19672,7 +19690,7 @@
           <w:sz w:val="22"/>
           <w:szCs w:val="22"/>
         </w:rPr>
-        <w:t xml:space="preserve"> and mark yourself. After each item you see the rule. The mistakes are the subtle ones: moods and tenses, pronouns, relative pronouns, prepositions. Finding the faulty word earns half a mark; saying the correction exactly earns the other half.</w:t>
+        <w:t xml:space="preserve">. After each item you see the rule. The mistakes are the subtle ones: moods and tenses, pronouns, relative pronouns, prepositions.</w:t>
       </w:r>
     </w:p>
     <w:p>
@@ -19700,7 +19718,7 @@
           <w:sz w:val="22"/>
           <w:szCs w:val="22"/>
         </w:rPr>
-        <w:t xml:space="preserve"> the sentence is cut into groups of words. Click them in the right order, then Check. Click a word in the top box to take it back. This is the only exercise the Studio marks for you: the order must be exactly right.</w:t>
+        <w:t xml:space="preserve"> the sentence is cut into groups of words. Click them in the right order, then Check. Click a word in the top box to take it back. The Studio tells you whether the order is exactly right.</w:t>
       </w:r>
     </w:p>
     <w:p>
@@ -19746,7 +19764,25 @@
           <w:sz w:val="22"/>
           <w:szCs w:val="22"/>
         </w:rPr>
-        <w:t xml:space="preserve"> and mark yourself.</w:t>
+        <w:t xml:space="preserve">, then </w:t>
+      </w:r>
+      <w:r>
+        <w:rPr>
+          <w:rFonts w:ascii="Arial" w:cs="Arial" w:eastAsia="Arial" w:hAnsi="Arial"/>
+          <w:b/>
+          <w:bCs/>
+          <w:sz w:val="22"/>
+          <w:szCs w:val="22"/>
+        </w:rPr>
+        <w:t xml:space="preserve">Next</w:t>
+      </w:r>
+      <w:r>
+        <w:rPr>
+          <w:rFonts w:ascii="Arial" w:cs="Arial" w:eastAsia="Arial" w:hAnsi="Arial"/>
+          <w:sz w:val="22"/>
+          <w:szCs w:val="22"/>
+        </w:rPr>
+        <w:t xml:space="preserve">.</w:t>
       </w:r>
     </w:p>
     <w:p>
@@ -19792,7 +19828,25 @@
           <w:sz w:val="22"/>
           <w:szCs w:val="22"/>
         </w:rPr>
-        <w:t xml:space="preserve"> and mark yourself.</w:t>
+        <w:t xml:space="preserve">, then </w:t>
+      </w:r>
+      <w:r>
+        <w:rPr>
+          <w:rFonts w:ascii="Arial" w:cs="Arial" w:eastAsia="Arial" w:hAnsi="Arial"/>
+          <w:b/>
+          <w:bCs/>
+          <w:sz w:val="22"/>
+          <w:szCs w:val="22"/>
+        </w:rPr>
+        <w:t xml:space="preserve">Next</w:t>
+      </w:r>
+      <w:r>
+        <w:rPr>
+          <w:rFonts w:ascii="Arial" w:cs="Arial" w:eastAsia="Arial" w:hAnsi="Arial"/>
+          <w:sz w:val="22"/>
+          <w:szCs w:val="22"/>
+        </w:rPr>
+        <w:t xml:space="preserve">.</w:t>
       </w:r>
     </w:p>
     <w:p>
@@ -19820,7 +19874,7 @@
           <w:sz w:val="22"/>
           <w:szCs w:val="22"/>
         </w:rPr>
-        <w:t xml:space="preserve"> a round with all five kinds of exercise, with a score for each kind at the end.</w:t>
+        <w:t xml:space="preserve"> a round with all five kinds of exercise.</w:t>
       </w:r>
     </w:p>
     <w:p>
@@ -19840,51 +19894,125 @@
           <w:sz w:val="22"/>
           <w:szCs w:val="22"/>
         </w:rPr>
-        <w:t xml:space="preserve">Nothing is typed:</w:t>
-      </w:r>
-      <w:r>
-        <w:rPr>
-          <w:rFonts w:ascii="Arial" w:cs="Arial" w:eastAsia="Arial" w:hAnsi="Arial"/>
-          <w:sz w:val="22"/>
-          <w:szCs w:val="22"/>
-        </w:rPr>
-        <w:t xml:space="preserve"> you say the answers aloud and mark yourself honestly. </w:t>
-      </w:r>
-      <w:r>
-        <w:rPr>
-          <w:rFonts w:ascii="Arial" w:cs="Arial" w:eastAsia="Arial" w:hAnsi="Arial"/>
-          <w:b/>
-          <w:bCs/>
-          <w:sz w:val="22"/>
-          <w:szCs w:val="22"/>
-        </w:rPr>
-        <w:t xml:space="preserve">Perfect</w:t>
-      </w:r>
-      <w:r>
-        <w:rPr>
-          <w:rFonts w:ascii="Arial" w:cs="Arial" w:eastAsia="Arial" w:hAnsi="Arial"/>
-          <w:sz w:val="22"/>
-          <w:szCs w:val="22"/>
-        </w:rPr>
-        <w:t xml:space="preserve"> means you said exactly the approved wording; anything less is </w:t>
-      </w:r>
-      <w:r>
-        <w:rPr>
-          <w:rFonts w:ascii="Arial" w:cs="Arial" w:eastAsia="Arial" w:hAnsi="Arial"/>
-          <w:b/>
-          <w:bCs/>
-          <w:sz w:val="22"/>
-          <w:szCs w:val="22"/>
-        </w:rPr>
-        <w:t xml:space="preserve">Not yet</w:t>
-      </w:r>
-      <w:r>
-        <w:rPr>
-          <w:rFonts w:ascii="Arial" w:cs="Arial" w:eastAsia="Arial" w:hAnsi="Arial"/>
-          <w:sz w:val="22"/>
-          <w:szCs w:val="22"/>
-        </w:rPr>
-        <w:t xml:space="preserve">. Keys: Space or Enter shows the answer; ← or 1 for Not yet, → or 2 for Perfect. Best scores are kept on this device. Nothing is sent to AP.</w:t>
+        <w:t xml:space="preserve">Nothing is typed or scored:</w:t>
+      </w:r>
+      <w:r>
+        <w:rPr>
+          <w:rFonts w:ascii="Arial" w:cs="Arial" w:eastAsia="Arial" w:hAnsi="Arial"/>
+          <w:sz w:val="22"/>
+          <w:szCs w:val="22"/>
+        </w:rPr>
+        <w:t xml:space="preserve"> you say the answers aloud and check them against the approved wording yourself. Keys: Space or Enter shows the answer; Space, Enter or → moves to the next item. Nothing is sent to AP.</w:t>
+      </w:r>
+    </w:p>
+    <w:p>
+      <w:pPr>
+        <w:pStyle w:val="ListParagraph"/>
+        <w:numPr>
+          <w:ilvl w:val="0"/>
+          <w:numId w:val="2"/>
+        </w:numPr>
+        <w:spacing w:after="60" w:line="276"/>
+      </w:pPr>
+      <w:r>
+        <w:rPr>
+          <w:rFonts w:ascii="Arial" w:cs="Arial" w:eastAsia="Arial" w:hAnsi="Arial"/>
+          <w:b/>
+          <w:bCs/>
+          <w:sz w:val="22"/>
+          <w:szCs w:val="22"/>
+        </w:rPr>
+        <w:t xml:space="preserve">AP Timed Spot Test:</w:t>
+      </w:r>
+      <w:r>
+        <w:rPr>
+          <w:rFonts w:ascii="Arial" w:cs="Arial" w:eastAsia="Arial" w:hAnsi="Arial"/>
+          <w:sz w:val="22"/>
+          <w:szCs w:val="22"/>
+        </w:rPr>
+        <w:t xml:space="preserve"> press </w:t>
+      </w:r>
+      <w:r>
+        <w:rPr>
+          <w:rFonts w:ascii="Arial" w:cs="Arial" w:eastAsia="Arial" w:hAnsi="Arial"/>
+          <w:b/>
+          <w:bCs/>
+          <w:sz w:val="22"/>
+          <w:szCs w:val="22"/>
+        </w:rPr>
+        <w:t xml:space="preserve">⏱ AP Timed Spot Test: this section</w:t>
+      </w:r>
+      <w:r>
+        <w:rPr>
+          <w:rFonts w:ascii="Arial" w:cs="Arial" w:eastAsia="Arial" w:hAnsi="Arial"/>
+          <w:sz w:val="22"/>
+          <w:szCs w:val="22"/>
+        </w:rPr>
+        <w:t xml:space="preserve"> (on a section, or at the end of a drill). Tick the kinds of task you want (Gaps, Spot the error, Rebuild, Short translations, Bold bits), then choose your </w:t>
+      </w:r>
+      <w:r>
+        <w:rPr>
+          <w:rFonts w:ascii="Arial" w:cs="Arial" w:eastAsia="Arial" w:hAnsi="Arial"/>
+          <w:b/>
+          <w:bCs/>
+          <w:sz w:val="22"/>
+          <w:szCs w:val="22"/>
+        </w:rPr>
+        <w:t xml:space="preserve">level</w:t>
+      </w:r>
+      <w:r>
+        <w:rPr>
+          <w:rFonts w:ascii="Arial" w:cs="Arial" w:eastAsia="Arial" w:hAnsi="Arial"/>
+          <w:sz w:val="22"/>
+          <w:szCs w:val="22"/>
+        </w:rPr>
+        <w:t xml:space="preserve">; your level is printed in big letters at the top of your PDF, and Mixed is right unless AP has told you otherwise. The items come from the approved sentences of that section and are fitted to about 4½ minutes. Each item carries a tag saying what to do (for example CORRECT THE GRAMMAR ERROR or TRANSLATE THE BOLD WORDS). Write your answers, submit, and AP marks it like every other AP Spot Test. This is the only place in the Studio where you are marked.</w:t>
+      </w:r>
+    </w:p>
+    <w:p>
+      <w:pPr>
+        <w:pStyle w:val="ListParagraph"/>
+        <w:numPr>
+          <w:ilvl w:val="0"/>
+          <w:numId w:val="2"/>
+        </w:numPr>
+        <w:spacing w:after="60" w:line="276"/>
+      </w:pPr>
+      <w:r>
+        <w:rPr>
+          <w:rFonts w:ascii="Arial" w:cs="Arial" w:eastAsia="Arial" w:hAnsi="Arial"/>
+          <w:b/>
+          <w:bCs/>
+          <w:sz w:val="22"/>
+          <w:szCs w:val="22"/>
+        </w:rPr>
+        <w:t xml:space="preserve">For teachers:</w:t>
+      </w:r>
+      <w:r>
+        <w:rPr>
+          <w:rFonts w:ascii="Arial" w:cs="Arial" w:eastAsia="Arial" w:hAnsi="Arial"/>
+          <w:sz w:val="22"/>
+          <w:szCs w:val="22"/>
+        </w:rPr>
+        <w:t xml:space="preserve"> the </w:t>
+      </w:r>
+      <w:r>
+        <w:rPr>
+          <w:rFonts w:ascii="Arial" w:cs="Arial" w:eastAsia="Arial" w:hAnsi="Arial"/>
+          <w:b/>
+          <w:bCs/>
+          <w:sz w:val="22"/>
+          <w:szCs w:val="22"/>
+        </w:rPr>
+        <w:t xml:space="preserve">🔑 Set as a test</w:t>
+      </w:r>
+      <w:r>
+        <w:rPr>
+          <w:rFonts w:ascii="Arial" w:cs="Arial" w:eastAsia="Arial" w:hAnsi="Arial"/>
+          <w:sz w:val="22"/>
+          <w:szCs w:val="22"/>
+        </w:rPr>
+        <w:t xml:space="preserve"> button (shown only when teacher mode is on) turns the same selection into a link or code for your boys.</w:t>
       </w:r>
     </w:p>
     <w:p>

</xml_diff>

<commit_message>
Approved Material Studio: Italian (exercises, Le parole, AP Structures, Spot Test), language chooser, guides
Co-Authored-By: Claude Sonnet 5.5 <noreply@anthropic.com>
Claude-Session: https://claude.ai/code/session_01S5rYTdm2Guhk5rucFAEyLg
</commit_message>
<xml_diff>
--- a/Word documents/AP_IGCSE_User_Guide.docx
+++ b/Word documents/AP_IGCSE_User_Guide.docx
@@ -18238,7 +18238,7 @@
           <w:sz w:val="22"/>
           <w:szCs w:val="22"/>
         </w:rPr>
-        <w:t xml:space="preserve">The app's own order is: study the Approved Material first, master it in the Approved Material Studio (French for now), then test yourself on the shorter Practice Sentences.</w:t>
+        <w:t xml:space="preserve">The app's own order is: study the Approved Material first, master it in the Approved Material Studio (French and Italian), then test yourself on the shorter Practice Sentences.</w:t>
       </w:r>
       <w:r>
         <w:rPr>
@@ -18410,7 +18410,7 @@
           <w:sz w:val="22"/>
           <w:szCs w:val="22"/>
         </w:rPr>
-        <w:t xml:space="preserve">. Tiles 1 and 3 switch what the rest of the home screen works on. Tile 2 opens the Studio (see below) and has a </w:t>
+        <w:t xml:space="preserve">. Tiles 1 and 3 switch what the rest of the home screen works on. Tile 2 opens the Studio (see below; you choose French or Italian) and has a </w:t>
       </w:r>
       <w:r>
         <w:rPr>
@@ -19175,7 +19175,7 @@
           <w:sz w:val="24"/>
           <w:szCs w:val="24"/>
         </w:rPr>
-        <w:t xml:space="preserve">Approved Material Studio (French)</w:t>
+        <w:t xml:space="preserve">Approved Material Studio (French and Italian)</w:t>
       </w:r>
     </w:p>
     <w:p>
@@ -19198,7 +19198,7 @@
           <w:sz w:val="22"/>
           <w:szCs w:val="22"/>
         </w:rPr>
-        <w:t xml:space="preserve"> becoming a real master of the Approved Material, section by section. Every exercise is built from the approved sentences themselves, so you are always working on exactly the wording you will use. Open it with the second tile on the home screen. It covers French only for now.</w:t>
+        <w:t xml:space="preserve"> becoming a real master of the Approved Material, section by section. Every exercise is built from the approved sentences themselves, so you are always working on exactly the wording you will use. Open it with the second tile on the home screen. It covers French and Italian: after you tap it, choose the language (Spanish will follow). In Italian the Les mots tab is called Le parole.</w:t>
       </w:r>
     </w:p>
     <w:p>

</xml_diff>

<commit_message>
Approved Material Studio: Spanish (exercises, Las palabras, AP Structures, Spot Test); fix 'demasiada grasa' in the Spanish source; guides
Co-Authored-By: Claude Sonnet 5.5 <noreply@anthropic.com>
Claude-Session: https://claude.ai/code/session_01S5rYTdm2Guhk5rucFAEyLg
</commit_message>
<xml_diff>
--- a/Word documents/AP_IGCSE_User_Guide.docx
+++ b/Word documents/AP_IGCSE_User_Guide.docx
@@ -18238,7 +18238,7 @@
           <w:sz w:val="22"/>
           <w:szCs w:val="22"/>
         </w:rPr>
-        <w:t xml:space="preserve">The app's own order is: study the Approved Material first, master it in the Approved Material Studio (French and Italian), then test yourself on the shorter Practice Sentences.</w:t>
+        <w:t xml:space="preserve">The app's own order is: study the Approved Material first, master it in the Approved Material Studio (French, Italian and Spanish), then test yourself on the shorter Practice Sentences.</w:t>
       </w:r>
       <w:r>
         <w:rPr>
@@ -18410,7 +18410,7 @@
           <w:sz w:val="22"/>
           <w:szCs w:val="22"/>
         </w:rPr>
-        <w:t xml:space="preserve">. Tiles 1 and 3 switch what the rest of the home screen works on. Tile 2 opens the Studio (see below; you choose French or Italian) and has a </w:t>
+        <w:t xml:space="preserve">. Tiles 1 and 3 switch what the rest of the home screen works on. Tile 2 opens the Studio (see below; you choose French, Italian or Spanish) and has a </w:t>
       </w:r>
       <w:r>
         <w:rPr>
@@ -19175,7 +19175,7 @@
           <w:sz w:val="24"/>
           <w:szCs w:val="24"/>
         </w:rPr>
-        <w:t xml:space="preserve">Approved Material Studio (French and Italian)</w:t>
+        <w:t xml:space="preserve">Approved Material Studio (French, Italian and Spanish)</w:t>
       </w:r>
     </w:p>
     <w:p>
@@ -19198,7 +19198,7 @@
           <w:sz w:val="22"/>
           <w:szCs w:val="22"/>
         </w:rPr>
-        <w:t xml:space="preserve"> becoming a real master of the Approved Material, section by section. Every exercise is built from the approved sentences themselves, so you are always working on exactly the wording you will use. Open it with the second tile on the home screen. It covers French and Italian: after you tap it, choose the language (Spanish will follow). In Italian the Les mots tab is called Le parole.</w:t>
+        <w:t xml:space="preserve"> becoming a real master of the Approved Material, section by section. Every exercise is built from the approved sentences themselves, so you are always working on exactly the wording you will use. Open it with the second tile on the home screen. It covers French, Italian and Spanish: after you tap it, choose the language. In Italian the Les mots tab is called Le parole, and in Spanish Las palabras.</w:t>
       </w:r>
     </w:p>
     <w:p>

</xml_diff>

<commit_message>
Approved Material Read and listen: English only (show and hear only the English); guides
Co-Authored-By: Claude Sonnet 5.5 <noreply@anthropic.com>
Claude-Session: https://claude.ai/code/session_01S5rYTdm2Guhk5rucFAEyLg
</commit_message>
<xml_diff>
--- a/Word documents/AP_IGCSE_User_Guide.docx
+++ b/Word documents/AP_IGCSE_User_Guide.docx
@@ -18848,15 +18848,15 @@
           <w:sz w:val="22"/>
           <w:szCs w:val="22"/>
         </w:rPr>
-        <w:t xml:space="preserve">🇬🇧 English</w:t>
-      </w:r>
-      <w:r>
-        <w:rPr>
-          <w:rFonts w:ascii="Arial" w:cs="Arial" w:eastAsia="Arial" w:hAnsi="Arial"/>
-          <w:sz w:val="22"/>
-          <w:szCs w:val="22"/>
-        </w:rPr>
-        <w:t xml:space="preserve"> switch and </w:t>
+        <w:t xml:space="preserve">🔊 Hear it in</w:t>
+      </w:r>
+      <w:r>
+        <w:rPr>
+          <w:rFonts w:ascii="Arial" w:cs="Arial" w:eastAsia="Arial" w:hAnsi="Arial"/>
+          <w:sz w:val="22"/>
+          <w:szCs w:val="22"/>
+        </w:rPr>
+        <w:t xml:space="preserve"> switch (the studied language or English), a 🇬🇧 Show English switch (English under each sentence), a 🇬🇧 English only switch (hides the studied language, shows only the English and reads only the English; press it again to go back) and </w:t>
       </w:r>
       <w:r>
         <w:rPr>

</xml_diff>

<commit_message>
Approved Material: Speed Challenge and Speed sessions fed from the Studio material; guides updated
Co-Authored-By: Claude Sonnet 5.5 <noreply@anthropic.com>
Claude-Session: https://claude.ai/code/session_01S5rYTdm2Guhk5rucFAEyLg
</commit_message>
<xml_diff>
--- a/Word documents/AP_IGCSE_User_Guide.docx
+++ b/Word documents/AP_IGCSE_User_Guide.docx
@@ -20041,6 +20041,62 @@
           <w:szCs w:val="22"/>
         </w:rPr>
         <w:t xml:space="preserve"> (top right) makes the type larger for a class. Space or Enter shows the answer and Enter moves on to the next item.</w:t>
+      </w:r>
+    </w:p>
+    <w:p>
+      <w:pPr>
+        <w:pStyle w:val="ListParagraph"/>
+        <w:numPr>
+          <w:ilvl w:val="0"/>
+          <w:numId w:val="2"/>
+        </w:numPr>
+        <w:spacing w:after="60" w:line="276"/>
+      </w:pPr>
+      <w:r>
+        <w:rPr>
+          <w:rFonts w:ascii="Arial" w:cs="Arial" w:eastAsia="Arial" w:hAnsi="Arial"/>
+          <w:b/>
+          <w:bCs/>
+          <w:sz w:val="22"/>
+          <w:szCs w:val="22"/>
+        </w:rPr>
+        <w:t xml:space="preserve">⚡ Speed Challenge:</w:t>
+      </w:r>
+      <w:r>
+        <w:rPr>
+          <w:rFonts w:ascii="Arial" w:cs="Arial" w:eastAsia="Arial" w:hAnsi="Arial"/>
+          <w:sz w:val="22"/>
+          <w:szCs w:val="22"/>
+        </w:rPr>
+        <w:t xml:space="preserve"> the same tile game as the vocabulary apps, fed from the Approved Material. Press ⚡ AP Speed Challenge on the main page (or ⚡ Speed inside the Studio). Choose the language, then Phrases (the key words and phrases, the short translations and the bold bits) or Sentences (the approved sentences), and the sections you want. The game's own test buttons are hidden here: tests are set from the Studio.</w:t>
+      </w:r>
+    </w:p>
+    <w:p>
+      <w:pPr>
+        <w:pStyle w:val="ListParagraph"/>
+        <w:numPr>
+          <w:ilvl w:val="0"/>
+          <w:numId w:val="2"/>
+        </w:numPr>
+        <w:spacing w:after="60" w:line="276"/>
+      </w:pPr>
+      <w:r>
+        <w:rPr>
+          <w:rFonts w:ascii="Arial" w:cs="Arial" w:eastAsia="Arial" w:hAnsi="Arial"/>
+          <w:b/>
+          <w:bCs/>
+          <w:sz w:val="22"/>
+          <w:szCs w:val="22"/>
+        </w:rPr>
+        <w:t xml:space="preserve">For teachers, Speed sessions:</w:t>
+      </w:r>
+      <w:r>
+        <w:rPr>
+          <w:rFonts w:ascii="Arial" w:cs="Arial" w:eastAsia="Arial" w:hAnsi="Arial"/>
+          <w:sz w:val="22"/>
+          <w:szCs w:val="22"/>
+        </w:rPr>
+        <w:t xml:space="preserve"> with teacher mode on, 🔗 Speed session link in the game turns the selection on screen into a locked link or code (pair work, no time limit), exactly as in the other apps.</w:t>
       </w:r>
     </w:p>
     <w:p>

</xml_diff>

<commit_message>
Approved Material: Section and Topic are tick-box pickers (one or more); Speed Challenge opens on the home-screen selection (direction, sections, topics); guides
Co-Authored-By: Claude Sonnet 5.5 <noreply@anthropic.com>
Claude-Session: https://claude.ai/code/session_01S5rYTdm2Guhk5rucFAEyLg
</commit_message>
<xml_diff>
--- a/Word documents/AP_IGCSE_User_Guide.docx
+++ b/Word documents/AP_IGCSE_User_Guide.docx
@@ -18502,7 +18502,7 @@
           <w:sz w:val="22"/>
           <w:szCs w:val="22"/>
         </w:rPr>
-        <w:t xml:space="preserve"> (or "ALL SECTIONS", or "MY SELECTION") and </w:t>
+        <w:t xml:space="preserve"> and </w:t>
       </w:r>
       <w:r>
         <w:rPr>
@@ -18520,7 +18520,79 @@
           <w:sz w:val="22"/>
           <w:szCs w:val="22"/>
         </w:rPr>
-        <w:t xml:space="preserve">.</w:t>
+        <w:t xml:space="preserve"> are drop-downs of tick boxes: tick one or more, or use </w:t>
+      </w:r>
+      <w:r>
+        <w:rPr>
+          <w:rFonts w:ascii="Arial" w:cs="Arial" w:eastAsia="Arial" w:hAnsi="Arial"/>
+          <w:b/>
+          <w:bCs/>
+          <w:sz w:val="22"/>
+          <w:szCs w:val="22"/>
+        </w:rPr>
+        <w:t xml:space="preserve">Tick all</w:t>
+      </w:r>
+      <w:r>
+        <w:rPr>
+          <w:rFonts w:ascii="Arial" w:cs="Arial" w:eastAsia="Arial" w:hAnsi="Arial"/>
+          <w:sz w:val="22"/>
+          <w:szCs w:val="22"/>
+        </w:rPr>
+        <w:t xml:space="preserve"> / </w:t>
+      </w:r>
+      <w:r>
+        <w:rPr>
+          <w:rFonts w:ascii="Arial" w:cs="Arial" w:eastAsia="Arial" w:hAnsi="Arial"/>
+          <w:b/>
+          <w:bCs/>
+          <w:sz w:val="22"/>
+          <w:szCs w:val="22"/>
+        </w:rPr>
+        <w:t xml:space="preserve">Clear</w:t>
+      </w:r>
+      <w:r>
+        <w:rPr>
+          <w:rFonts w:ascii="Arial" w:cs="Arial" w:eastAsia="Arial" w:hAnsi="Arial"/>
+          <w:sz w:val="22"/>
+          <w:szCs w:val="22"/>
+        </w:rPr>
+        <w:t xml:space="preserve"> and the </w:t>
+      </w:r>
+      <w:r>
+        <w:rPr>
+          <w:rFonts w:ascii="Arial" w:cs="Arial" w:eastAsia="Arial" w:hAnsi="Arial"/>
+          <w:b/>
+          <w:bCs/>
+          <w:sz w:val="22"/>
+          <w:szCs w:val="22"/>
+        </w:rPr>
+        <w:t xml:space="preserve">All of A</w:t>
+      </w:r>
+      <w:r>
+        <w:rPr>
+          <w:rFonts w:ascii="Arial" w:cs="Arial" w:eastAsia="Arial" w:hAnsi="Arial"/>
+          <w:sz w:val="22"/>
+          <w:szCs w:val="22"/>
+        </w:rPr>
+        <w:t xml:space="preserve"> style group boxes, then press </w:t>
+      </w:r>
+      <w:r>
+        <w:rPr>
+          <w:rFonts w:ascii="Arial" w:cs="Arial" w:eastAsia="Arial" w:hAnsi="Arial"/>
+          <w:b/>
+          <w:bCs/>
+          <w:sz w:val="22"/>
+          <w:szCs w:val="22"/>
+        </w:rPr>
+        <w:t xml:space="preserve">Done</w:t>
+      </w:r>
+      <w:r>
+        <w:rPr>
+          <w:rFonts w:ascii="Arial" w:cs="Arial" w:eastAsia="Arial" w:hAnsi="Arial"/>
+          <w:sz w:val="22"/>
+          <w:szCs w:val="22"/>
+        </w:rPr>
+        <w:t xml:space="preserve"> (or click anywhere else). With several ticked, the drill, Leisure Mode, tests and the ⚡ AP Speed Challenge all use exactly that selection.</w:t>
       </w:r>
     </w:p>
     <w:p>
@@ -20068,7 +20140,7 @@
           <w:sz w:val="22"/>
           <w:szCs w:val="22"/>
         </w:rPr>
-        <w:t xml:space="preserve"> the same tile game as the vocabulary apps, fed from the Approved Material. Press ⚡ AP Speed Challenge on the main page (or ⚡ Speed inside the Studio). Choose the language, then Phrases (the key words and phrases, the short translations and the bold bits) or Sentences (the approved sentences), and the sections you want. The game's own test buttons are hidden here: tests are set from the Studio.</w:t>
+        <w:t xml:space="preserve"> the same tile game as the vocabulary apps, fed from the Approved Material. Press ⚡ AP Speed Challenge on the main page (or ⚡ Speed inside the Studio). From the main page it opens on what the home screen shows: the direction (English → language or language → English), the sections and the topics you have ticked, as the approved sentences. Choose the language, then Phrases (the key words and phrases, the short translations and the bold bits) or Sentences (the approved sentences), and the sections you want. The game's own test buttons are hidden here: tests are set from the Studio.</w:t>
       </w:r>
     </w:p>
     <w:p>

</xml_diff>

<commit_message>
Approved Material: the initials AP are always spoken in English as 'Ay Pee' in every language; guide
Co-Authored-By: Claude Sonnet 5.5 <noreply@anthropic.com>
Claude-Session: https://claude.ai/code/session_01S5rYTdm2Guhk5rucFAEyLg
</commit_message>
<xml_diff>
--- a/Word documents/AP_IGCSE_User_Guide.docx
+++ b/Word documents/AP_IGCSE_User_Guide.docx
@@ -1967,6 +1967,14 @@
           <w:szCs w:val="22"/>
         </w:rPr>
         <w:t xml:space="preserve">.</w:t>
+      </w:r>
+      <w:r>
+        <w:rPr>
+          <w:rFonts w:ascii="Arial" w:cs="Arial" w:eastAsia="Arial" w:hAnsi="Arial"/>
+          <w:sz w:val="22"/>
+          <w:szCs w:val="22"/>
+        </w:rPr>
+        <w:t xml:space="preserve"> In the Approved Material, the initials AP are always spoken in English as “Ay Pee”, whatever the language of the sentence.</w:t>
       </w:r>
     </w:p>
     <w:p>

</xml_diff>

<commit_message>
Approved Material: AP Structures in the Studio drills (translate and gap), Mixed, AP Timed Spot Test kinds and Speed Challenge tiles; guides
Co-Authored-By: Claude Sonnet 5.5 <noreply@anthropic.com>
Claude-Session: https://claude.ai/code/session_01S5rYTdm2Guhk5rucFAEyLg
</commit_message>
<xml_diff>
--- a/Word documents/AP_IGCSE_User_Guide.docx
+++ b/Word documents/AP_IGCSE_User_Guide.docx
@@ -19946,15 +19946,15 @@
           <w:sz w:val="22"/>
           <w:szCs w:val="22"/>
         </w:rPr>
-        <w:t xml:space="preserve">Mixed:</w:t>
-      </w:r>
-      <w:r>
-        <w:rPr>
-          <w:rFonts w:ascii="Arial" w:cs="Arial" w:eastAsia="Arial" w:hAnsi="Arial"/>
-          <w:sz w:val="22"/>
-          <w:szCs w:val="22"/>
-        </w:rPr>
-        <w:t xml:space="preserve"> a round with all five kinds of exercise.</w:t>
+        <w:t xml:space="preserve">AP Structures:</w:t>
+      </w:r>
+      <w:r>
+        <w:rPr>
+          <w:rFonts w:ascii="Arial" w:cs="Arial" w:eastAsia="Arial" w:hAnsi="Arial"/>
+          <w:sz w:val="22"/>
+          <w:szCs w:val="22"/>
+        </w:rPr>
+        <w:t xml:space="preserve"> the AP Structures chosen for each task (the reusable frames that expand an answer, with X, Y, INF and ADJ slots, shown under “Structures AP” in the word lists) are drilled two ways: say the French for the English frame, or say the missing word in the French frame. They are also in Mixed, as tiles in the ⚡ AP Speed Challenge (Phrases), and as a task kind in the ⏱ AP Timed Spot Test.</w:t>
       </w:r>
     </w:p>
     <w:p>
@@ -19974,15 +19974,15 @@
           <w:sz w:val="22"/>
           <w:szCs w:val="22"/>
         </w:rPr>
-        <w:t xml:space="preserve">Nothing is typed or scored:</w:t>
-      </w:r>
-      <w:r>
-        <w:rPr>
-          <w:rFonts w:ascii="Arial" w:cs="Arial" w:eastAsia="Arial" w:hAnsi="Arial"/>
-          <w:sz w:val="22"/>
-          <w:szCs w:val="22"/>
-        </w:rPr>
-        <w:t xml:space="preserve"> you say the answers aloud and check them against the approved wording yourself. Keys: Space or Enter shows the answer; Space, Enter or → moves to the next item. Nothing is sent to AP.</w:t>
+        <w:t xml:space="preserve">Mixed:</w:t>
+      </w:r>
+      <w:r>
+        <w:rPr>
+          <w:rFonts w:ascii="Arial" w:cs="Arial" w:eastAsia="Arial" w:hAnsi="Arial"/>
+          <w:sz w:val="22"/>
+          <w:szCs w:val="22"/>
+        </w:rPr>
+        <w:t xml:space="preserve"> a round with all five kinds of exercise.</w:t>
       </w:r>
     </w:p>
     <w:p>
@@ -20002,6 +20002,34 @@
           <w:sz w:val="22"/>
           <w:szCs w:val="22"/>
         </w:rPr>
+        <w:t xml:space="preserve">Nothing is typed or scored:</w:t>
+      </w:r>
+      <w:r>
+        <w:rPr>
+          <w:rFonts w:ascii="Arial" w:cs="Arial" w:eastAsia="Arial" w:hAnsi="Arial"/>
+          <w:sz w:val="22"/>
+          <w:szCs w:val="22"/>
+        </w:rPr>
+        <w:t xml:space="preserve"> you say the answers aloud and check them against the approved wording yourself. Keys: Space or Enter shows the answer; Space, Enter or → moves to the next item. Nothing is sent to AP.</w:t>
+      </w:r>
+    </w:p>
+    <w:p>
+      <w:pPr>
+        <w:pStyle w:val="ListParagraph"/>
+        <w:numPr>
+          <w:ilvl w:val="0"/>
+          <w:numId w:val="2"/>
+        </w:numPr>
+        <w:spacing w:after="60" w:line="276"/>
+      </w:pPr>
+      <w:r>
+        <w:rPr>
+          <w:rFonts w:ascii="Arial" w:cs="Arial" w:eastAsia="Arial" w:hAnsi="Arial"/>
+          <w:b/>
+          <w:bCs/>
+          <w:sz w:val="22"/>
+          <w:szCs w:val="22"/>
+        </w:rPr>
         <w:t xml:space="preserve">AP Timed Spot Test:</w:t>
       </w:r>
       <w:r>
@@ -20028,7 +20056,7 @@
           <w:sz w:val="22"/>
           <w:szCs w:val="22"/>
         </w:rPr>
-        <w:t xml:space="preserve"> (on a section, or at the end of a drill). Tick the kinds of task you want (Gaps, Spot the error, Rebuild, Short translations, Bold bits), then choose your </w:t>
+        <w:t xml:space="preserve"> (on a section, or at the end of a drill). Tick the kinds of task you want (Gaps, Spot the error, Rebuild, Short translations, Bold bits, AP Structures), then choose your </w:t>
       </w:r>
       <w:r>
         <w:rPr>

</xml_diff>

<commit_message>
Restamp build; Word guide: Studio look and autoplay
Co-Authored-By: Claude Sonnet 5.5 <noreply@anthropic.com>
Claude-Session: https://claude.ai/code/session_01S5rYTdm2Guhk5rucFAEyLg
</commit_message>
<xml_diff>
--- a/Word documents/AP_IGCSE_User_Guide.docx
+++ b/Word documents/AP_IGCSE_User_Guide.docx
@@ -19983,6 +19983,34 @@
           <w:szCs w:val="22"/>
         </w:rPr>
         <w:t xml:space="preserve"> a round with all six kinds of exercise.</w:t>
+      </w:r>
+    </w:p>
+    <w:p>
+      <w:pPr>
+        <w:pStyle w:val="ListParagraph"/>
+        <w:numPr>
+          <w:ilvl w:val="0"/>
+          <w:numId w:val="2"/>
+        </w:numPr>
+        <w:spacing w:after="60" w:line="276"/>
+      </w:pPr>
+      <w:r>
+        <w:rPr>
+          <w:rFonts w:ascii="Arial" w:cs="Arial" w:eastAsia="Arial" w:hAnsi="Arial"/>
+          <w:b/>
+          <w:bCs/>
+          <w:sz w:val="22"/>
+          <w:szCs w:val="22"/>
+        </w:rPr>
+        <w:t xml:space="preserve">Look and sound: </w:t>
+      </w:r>
+      <w:r>
+        <w:rPr>
+          <w:rFonts w:ascii="Arial" w:cs="Arial" w:eastAsia="Arial" w:hAnsi="Arial"/>
+          <w:sz w:val="22"/>
+          <w:szCs w:val="22"/>
+        </w:rPr>
+        <w:t xml:space="preserve">the Studio uses the full width of the screen. Each kind of task has its own colour, with a progress bar along the top of the card. Whenever the answer appears (Show the answer, Show the French, Check, or the end of Spot the error) it is read aloud automatically in the language you are learning; press the speaker to hear it again.</w:t>
       </w:r>
     </w:p>
     <w:p>

</xml_diff>

<commit_message>
Eton always spoken EE-ton in every language voice; guides
Co-Authored-By: Claude Sonnet 5.5 <noreply@anthropic.com>
Claude-Session: https://claude.ai/code/session_01S5rYTdm2Guhk5rucFAEyLg
</commit_message>
<xml_diff>
--- a/Word documents/AP_IGCSE_User_Guide.docx
+++ b/Word documents/AP_IGCSE_User_Guide.docx
@@ -1975,6 +1975,14 @@
           <w:szCs w:val="22"/>
         </w:rPr>
         <w:t xml:space="preserve"> In the Approved Material, the initials AP are always meant to sound like “Ay Pee”, whatever the language of the sentence. The voice stays the sentence’s own (French, Italian or Spanish) and is given a spelling it reads that way.</w:t>
+      </w:r>
+      <w:r>
+        <w:rPr>
+          <w:rFonts w:ascii="Arial" w:cs="Arial" w:eastAsia="Arial" w:hAnsi="Arial"/>
+          <w:sz w:val="22"/>
+          <w:szCs w:val="22"/>
+        </w:rPr>
+        <w:t xml:space="preserve"> The same goes for the school name Eton, which is always said “EE-ton” (the French, Italian and Spanish voices are given a spelling that gets as close to the English sound as they can).</w:t>
       </w:r>
     </w:p>
     <w:p>

</xml_diff>

<commit_message>
Remove Eton pronunciation note from guides
Co-Authored-By: Claude Sonnet 5.5 <noreply@anthropic.com>
Claude-Session: https://claude.ai/code/session_01S5rYTdm2Guhk5rucFAEyLg
</commit_message>
<xml_diff>
--- a/Word documents/AP_IGCSE_User_Guide.docx
+++ b/Word documents/AP_IGCSE_User_Guide.docx
@@ -1975,14 +1975,6 @@
           <w:szCs w:val="22"/>
         </w:rPr>
         <w:t xml:space="preserve"> In the Approved Material, the initials AP are always meant to sound like “Ay Pee”, whatever the language of the sentence. The voice stays the sentence’s own (French, Italian or Spanish) and is given a spelling it reads that way.</w:t>
-      </w:r>
-      <w:r>
-        <w:rPr>
-          <w:rFonts w:ascii="Arial" w:cs="Arial" w:eastAsia="Arial" w:hAnsi="Arial"/>
-          <w:sz w:val="22"/>
-          <w:szCs w:val="22"/>
-        </w:rPr>
-        <w:t xml:space="preserve"> The same goes for the school name Eton, which is always said “EE-ton” (the French, Italian and Spanish voices are given a spelling that gets as close to the English sound as they can).</w:t>
       </w:r>
     </w:p>
     <w:p>

</xml_diff>

<commit_message>
Guides: drop pronunciation detail (users only need to know how to use the app)
Co-Authored-By: Claude Sonnet 5.5 <noreply@anthropic.com>
Claude-Session: https://claude.ai/code/session_01S5rYTdm2Guhk5rucFAEyLg
</commit_message>
<xml_diff>
--- a/Word documents/AP_IGCSE_User_Guide.docx
+++ b/Word documents/AP_IGCSE_User_Guide.docx
@@ -1967,14 +1967,6 @@
           <w:szCs w:val="22"/>
         </w:rPr>
         <w:t xml:space="preserve">.</w:t>
-      </w:r>
-      <w:r>
-        <w:rPr>
-          <w:rFonts w:ascii="Arial" w:cs="Arial" w:eastAsia="Arial" w:hAnsi="Arial"/>
-          <w:sz w:val="22"/>
-          <w:szCs w:val="22"/>
-        </w:rPr>
-        <w:t xml:space="preserve"> In the Approved Material, the initials AP are always meant to sound like “Ay Pee”, whatever the language of the sentence. The voice stays the sentence’s own (French, Italian or Spanish) and is given a spelling it reads that way.</w:t>
       </w:r>
     </w:p>
     <w:p>

</xml_diff>

<commit_message>
Approved Material home: use wide screens (two columns); guide line for combining sections
Co-Authored-By: Claude Sonnet 5.5 <noreply@anthropic.com>
Claude-Session: https://claude.ai/code/session_01S5rYTdm2Guhk5rucFAEyLg
</commit_message>
<xml_diff>
--- a/Word documents/AP_IGCSE_User_Guide.docx
+++ b/Word documents/AP_IGCSE_User_Guide.docx
@@ -19417,6 +19417,34 @@
           <w:szCs w:val="22"/>
         </w:rPr>
         <w:t xml:space="preserve"> button shows or hides the English under a sentence.</w:t>
+      </w:r>
+    </w:p>
+    <w:p>
+      <w:pPr>
+        <w:pStyle w:val="ListParagraph"/>
+        <w:numPr>
+          <w:ilvl w:val="0"/>
+          <w:numId w:val="2"/>
+        </w:numPr>
+        <w:spacing w:after="60" w:line="276"/>
+      </w:pPr>
+      <w:r>
+        <w:rPr>
+          <w:rFonts w:ascii="Arial" w:cs="Arial" w:eastAsia="Arial" w:hAnsi="Arial"/>
+          <w:b/>
+          <w:bCs/>
+          <w:sz w:val="22"/>
+          <w:szCs w:val="22"/>
+        </w:rPr>
+        <w:t xml:space="preserve">Combine sections:</w:t>
+      </w:r>
+      <w:r>
+        <w:rPr>
+          <w:rFonts w:ascii="Arial" w:cs="Arial" w:eastAsia="Arial" w:hAnsi="Arial"/>
+          <w:sz w:val="22"/>
+          <w:szCs w:val="22"/>
+        </w:rPr>
+        <w:t xml:space="preserve"> on the Studio home page, tick the box in the corner of any sections you want (or use the A to E buttons for a whole area, or All), and the three buttons at the top change to match, for example “Mixed: 3 sections”. Mixed, the AP Timed Spot Test and the AP Speed Challenge then use only the sections you ticked. Clear takes the ticks away. Clicking a section tile itself still opens just that one section.</w:t>
       </w:r>
     </w:p>
     <w:p>

</xml_diff>

<commit_message>
Studio: picture view with spots and demo, picture machine, resume, themes, splash; 38 pictures; guides updated
Co-Authored-By: Claude Sonnet 5.5 <noreply@anthropic.com>
Claude-Session: https://claude.ai/code/session_01S5rYTdm2Guhk5rucFAEyLg
</commit_message>
<xml_diff>
--- a/Word documents/AP_IGCSE_User_Guide.docx
+++ b/Word documents/AP_IGCSE_User_Guide.docx
@@ -19290,33 +19290,31 @@
           <w:sz w:val="22"/>
           <w:szCs w:val="22"/>
         </w:rPr>
-        <w:t xml:space="preserve">Home:</w:t>
-      </w:r>
-      <w:r>
-        <w:rPr>
-          <w:rFonts w:ascii="Arial" w:cs="Arial" w:eastAsia="Arial" w:hAnsi="Arial"/>
-          <w:sz w:val="22"/>
-          <w:szCs w:val="22"/>
-        </w:rPr>
-        <w:t xml:space="preserve"> a tile for each of the 19 sections and </w:t>
-      </w:r>
-      <w:r>
-        <w:rPr>
-          <w:rFonts w:ascii="Arial" w:cs="Arial" w:eastAsia="Arial" w:hAnsi="Arial"/>
-          <w:b/>
-          <w:bCs/>
-          <w:sz w:val="22"/>
-          <w:szCs w:val="22"/>
-        </w:rPr>
-        <w:t xml:space="preserve">Mixed: all sections</w:t>
-      </w:r>
-      <w:r>
-        <w:rPr>
-          <w:rFonts w:ascii="Arial" w:cs="Arial" w:eastAsia="Arial" w:hAnsi="Arial"/>
-          <w:sz w:val="22"/>
-          <w:szCs w:val="22"/>
-        </w:rPr>
-        <w:t xml:space="preserve"> for a random round across everything. Nothing in the Studio is scored.</w:t>
+        <w:t xml:space="preserve">Home: </w:t>
+      </w:r>
+      <w:r>
+        <w:rPr>
+          <w:rFonts w:ascii="Arial" w:cs="Arial" w:eastAsia="Arial" w:hAnsi="Arial"/>
+          <w:sz w:val="22"/>
+          <w:szCs w:val="22"/>
+        </w:rPr>
+        <w:t>a big picture with two buttons: Choose a topic and 🎰 Picture machine. If you have used the Studio before, a Resume button takes you back to where you left off. Under More options are Mixed, Combine sections and Replay intro. A short intro with sound plays the first time; press Skip to go straight in. Nothing in the Studio is scored.</w:t>
+      </w:r>
+      <w:r>
+        <w:rPr>
+          <w:rFonts w:ascii="Arial" w:cs="Arial" w:eastAsia="Arial" w:hAnsi="Arial"/>
+          <w:b/>
+          <w:bCs/>
+          <w:sz w:val="22"/>
+          <w:szCs w:val="22"/>
+        </w:rPr>
+      </w:r>
+      <w:r>
+        <w:rPr>
+          <w:rFonts w:ascii="Arial" w:cs="Arial" w:eastAsia="Arial" w:hAnsi="Arial"/>
+          <w:sz w:val="22"/>
+          <w:szCs w:val="22"/>
+        </w:rPr>
       </w:r>
     </w:p>
     <w:p>
@@ -19336,87 +19334,31 @@
           <w:sz w:val="22"/>
           <w:szCs w:val="22"/>
         </w:rPr>
-        <w:t xml:space="preserve">On each section:</w:t>
-      </w:r>
-      <w:r>
-        <w:rPr>
-          <w:rFonts w:ascii="Arial" w:cs="Arial" w:eastAsia="Arial" w:hAnsi="Arial"/>
-          <w:sz w:val="22"/>
-          <w:szCs w:val="22"/>
-        </w:rPr>
-        <w:t xml:space="preserve"> choose </w:t>
-      </w:r>
-      <w:r>
-        <w:rPr>
-          <w:rFonts w:ascii="Arial" w:cs="Arial" w:eastAsia="Arial" w:hAnsi="Arial"/>
-          <w:b/>
-          <w:bCs/>
-          <w:sz w:val="22"/>
-          <w:szCs w:val="22"/>
-        </w:rPr>
-        <w:t xml:space="preserve">All questions in this section</w:t>
-      </w:r>
-      <w:r>
-        <w:rPr>
-          <w:rFonts w:ascii="Arial" w:cs="Arial" w:eastAsia="Arial" w:hAnsi="Arial"/>
-          <w:sz w:val="22"/>
-          <w:szCs w:val="22"/>
-        </w:rPr>
-        <w:t xml:space="preserve"> or a single question, a </w:t>
-      </w:r>
-      <w:r>
-        <w:rPr>
-          <w:rFonts w:ascii="Arial" w:cs="Arial" w:eastAsia="Arial" w:hAnsi="Arial"/>
-          <w:b/>
-          <w:bCs/>
-          <w:sz w:val="22"/>
-          <w:szCs w:val="22"/>
-        </w:rPr>
-        <w:t xml:space="preserve">Level</w:t>
-      </w:r>
-      <w:r>
-        <w:rPr>
-          <w:rFonts w:ascii="Arial" w:cs="Arial" w:eastAsia="Arial" w:hAnsi="Arial"/>
-          <w:sz w:val="22"/>
-          <w:szCs w:val="22"/>
-        </w:rPr>
-        <w:t xml:space="preserve"> (Mixed, Easy, Medium or Hard, set by the length of the sentence) and how many </w:t>
-      </w:r>
-      <w:r>
-        <w:rPr>
-          <w:rFonts w:ascii="Arial" w:cs="Arial" w:eastAsia="Arial" w:hAnsi="Arial"/>
-          <w:b/>
-          <w:bCs/>
-          <w:sz w:val="22"/>
-          <w:szCs w:val="22"/>
-        </w:rPr>
-        <w:t xml:space="preserve">Items</w:t>
-      </w:r>
-      <w:r>
-        <w:rPr>
-          <w:rFonts w:ascii="Arial" w:cs="Arial" w:eastAsia="Arial" w:hAnsi="Arial"/>
-          <w:sz w:val="22"/>
-          <w:szCs w:val="22"/>
-        </w:rPr>
-        <w:t xml:space="preserve"> (10, 20 or All). The </w:t>
-      </w:r>
-      <w:r>
-        <w:rPr>
-          <w:rFonts w:ascii="Arial" w:cs="Arial" w:eastAsia="Arial" w:hAnsi="Arial"/>
-          <w:b/>
-          <w:bCs/>
-          <w:sz w:val="22"/>
-          <w:szCs w:val="22"/>
-        </w:rPr>
-        <w:t xml:space="preserve">English hint</w:t>
-      </w:r>
-      <w:r>
-        <w:rPr>
-          <w:rFonts w:ascii="Arial" w:cs="Arial" w:eastAsia="Arial" w:hAnsi="Arial"/>
-          <w:sz w:val="22"/>
-          <w:szCs w:val="22"/>
-        </w:rPr>
-        <w:t xml:space="preserve"> button shows or hides the English under a sentence.</w:t>
+        <w:t xml:space="preserve">Choose a topic: </w:t>
+      </w:r>
+      <w:r>
+        <w:rPr>
+          <w:rFonts w:ascii="Arial" w:cs="Arial" w:eastAsia="Arial" w:hAnsi="Arial"/>
+          <w:sz w:val="22"/>
+          <w:szCs w:val="22"/>
+        </w:rPr>
+        <w:t>pick one of the five areas (A to E), then a section. Sections that have pictures open on the Pictures tab. Choose the topic from the list, then click the numbers on the picture: you hear the approved phrase in the language, and a second click on the same number shows and says it in English. ▶ Demo reads the topic&amp;rsquo;s approved sentences aloud while the matching numbers light up; press it again to stop. The full-screen button fills the screen for projecting.</w:t>
+      </w:r>
+      <w:r>
+        <w:rPr>
+          <w:rFonts w:ascii="Arial" w:cs="Arial" w:eastAsia="Arial" w:hAnsi="Arial"/>
+          <w:b/>
+          <w:bCs/>
+          <w:sz w:val="22"/>
+          <w:szCs w:val="22"/>
+        </w:rPr>
+      </w:r>
+      <w:r>
+        <w:rPr>
+          <w:rFonts w:ascii="Arial" w:cs="Arial" w:eastAsia="Arial" w:hAnsi="Arial"/>
+          <w:sz w:val="22"/>
+          <w:szCs w:val="22"/>
+        </w:rPr>
       </w:r>
     </w:p>
     <w:p>
@@ -19436,15 +19378,159 @@
           <w:sz w:val="22"/>
           <w:szCs w:val="22"/>
         </w:rPr>
-        <w:t xml:space="preserve">Combine sections:</w:t>
-      </w:r>
-      <w:r>
-        <w:rPr>
-          <w:rFonts w:ascii="Arial" w:cs="Arial" w:eastAsia="Arial" w:hAnsi="Arial"/>
-          <w:sz w:val="22"/>
-          <w:szCs w:val="22"/>
-        </w:rPr>
-        <w:t xml:space="preserve"> on the Studio home page, tick the box in the corner of any sections you want (or use the A to E buttons for a whole area, or All), and the three buttons at the top change to match, for example “Mixed: 3 sections”. Mixed, the AP Timed Spot Test and the AP Speed Challenge then use only the sections you ticked. Clear takes the ticks away. Clicking a section tile itself still opens just that one section.</w:t>
+        <w:t xml:space="preserve">Picture machine: </w:t>
+      </w:r>
+      <w:r>
+        <w:rPr>
+          <w:rFonts w:ascii="Arial" w:cs="Arial" w:eastAsia="Arial" w:hAnsi="Arial"/>
+          <w:sz w:val="22"/>
+          <w:szCs w:val="22"/>
+        </w:rPr>
+        <w:t>press Picture machine, choose which areas to draw from and press Set up the machine, then Spin. A random picture lands with a talk timer. Press Show to see the numbers and mark yourself OK or Near. Pictures do not repeat until all have been seen, and the tally is shown. The Back button goes back one stage at a time.</w:t>
+      </w:r>
+      <w:r>
+        <w:rPr>
+          <w:rFonts w:ascii="Arial" w:cs="Arial" w:eastAsia="Arial" w:hAnsi="Arial"/>
+          <w:b/>
+          <w:bCs/>
+          <w:sz w:val="22"/>
+          <w:szCs w:val="22"/>
+        </w:rPr>
+      </w:r>
+      <w:r>
+        <w:rPr>
+          <w:rFonts w:ascii="Arial" w:cs="Arial" w:eastAsia="Arial" w:hAnsi="Arial"/>
+          <w:sz w:val="22"/>
+          <w:szCs w:val="22"/>
+        </w:rPr>
+      </w:r>
+    </w:p>
+    <w:p>
+      <w:pPr>
+        <w:pStyle w:val="ListParagraph"/>
+        <w:numPr>
+          <w:ilvl w:val="0"/>
+          <w:numId w:val="2"/>
+        </w:numPr>
+        <w:spacing w:after="60" w:line="276"/>
+      </w:pPr>
+      <w:r>
+        <w:rPr>
+          <w:rFonts w:ascii="Arial" w:cs="Arial" w:eastAsia="Arial" w:hAnsi="Arial"/>
+          <w:b/>
+          <w:bCs/>
+          <w:sz w:val="22"/>
+          <w:szCs w:val="22"/>
+        </w:rPr>
+        <w:t xml:space="preserve">On each section:</w:t>
+      </w:r>
+      <w:r>
+        <w:rPr>
+          <w:rFonts w:ascii="Arial" w:cs="Arial" w:eastAsia="Arial" w:hAnsi="Arial"/>
+          <w:sz w:val="22"/>
+          <w:szCs w:val="22"/>
+        </w:rPr>
+        <w:t xml:space="preserve"> choose </w:t>
+      </w:r>
+      <w:r>
+        <w:rPr>
+          <w:rFonts w:ascii="Arial" w:cs="Arial" w:eastAsia="Arial" w:hAnsi="Arial"/>
+          <w:b/>
+          <w:bCs/>
+          <w:sz w:val="22"/>
+          <w:szCs w:val="22"/>
+        </w:rPr>
+        <w:t xml:space="preserve">All questions in this section</w:t>
+      </w:r>
+      <w:r>
+        <w:rPr>
+          <w:rFonts w:ascii="Arial" w:cs="Arial" w:eastAsia="Arial" w:hAnsi="Arial"/>
+          <w:sz w:val="22"/>
+          <w:szCs w:val="22"/>
+        </w:rPr>
+        <w:t xml:space="preserve"> or a single question, a </w:t>
+      </w:r>
+      <w:r>
+        <w:rPr>
+          <w:rFonts w:ascii="Arial" w:cs="Arial" w:eastAsia="Arial" w:hAnsi="Arial"/>
+          <w:b/>
+          <w:bCs/>
+          <w:sz w:val="22"/>
+          <w:szCs w:val="22"/>
+        </w:rPr>
+        <w:t xml:space="preserve">Level</w:t>
+      </w:r>
+      <w:r>
+        <w:rPr>
+          <w:rFonts w:ascii="Arial" w:cs="Arial" w:eastAsia="Arial" w:hAnsi="Arial"/>
+          <w:sz w:val="22"/>
+          <w:szCs w:val="22"/>
+        </w:rPr>
+        <w:t xml:space="preserve"> (Mixed, Easy, Medium or Hard, set by the length of the sentence) and how many </w:t>
+      </w:r>
+      <w:r>
+        <w:rPr>
+          <w:rFonts w:ascii="Arial" w:cs="Arial" w:eastAsia="Arial" w:hAnsi="Arial"/>
+          <w:b/>
+          <w:bCs/>
+          <w:sz w:val="22"/>
+          <w:szCs w:val="22"/>
+        </w:rPr>
+        <w:t xml:space="preserve">Items</w:t>
+      </w:r>
+      <w:r>
+        <w:rPr>
+          <w:rFonts w:ascii="Arial" w:cs="Arial" w:eastAsia="Arial" w:hAnsi="Arial"/>
+          <w:sz w:val="22"/>
+          <w:szCs w:val="22"/>
+        </w:rPr>
+        <w:t xml:space="preserve"> (10, 20 or All). The </w:t>
+      </w:r>
+      <w:r>
+        <w:rPr>
+          <w:rFonts w:ascii="Arial" w:cs="Arial" w:eastAsia="Arial" w:hAnsi="Arial"/>
+          <w:b/>
+          <w:bCs/>
+          <w:sz w:val="22"/>
+          <w:szCs w:val="22"/>
+        </w:rPr>
+        <w:t xml:space="preserve">English hint</w:t>
+      </w:r>
+      <w:r>
+        <w:rPr>
+          <w:rFonts w:ascii="Arial" w:cs="Arial" w:eastAsia="Arial" w:hAnsi="Arial"/>
+          <w:sz w:val="22"/>
+          <w:szCs w:val="22"/>
+        </w:rPr>
+        <w:t xml:space="preserve"> button shows or hides the English under a sentence.</w:t>
+      </w:r>
+    </w:p>
+    <w:p>
+      <w:pPr>
+        <w:pStyle w:val="ListParagraph"/>
+        <w:numPr>
+          <w:ilvl w:val="0"/>
+          <w:numId w:val="2"/>
+        </w:numPr>
+        <w:spacing w:after="60" w:line="276"/>
+      </w:pPr>
+      <w:r>
+        <w:rPr>
+          <w:rFonts w:ascii="Arial" w:cs="Arial" w:eastAsia="Arial" w:hAnsi="Arial"/>
+          <w:b/>
+          <w:bCs/>
+          <w:sz w:val="22"/>
+          <w:szCs w:val="22"/>
+        </w:rPr>
+        <w:t>Combine sections:</w:t>
+      </w:r>
+      <w:r>
+        <w:rPr>
+          <w:rFonts w:ascii="Arial" w:cs="Arial" w:eastAsia="Arial" w:hAnsi="Arial"/>
+          <w:sz w:val="22"/>
+          <w:szCs w:val="22"/>
+        </w:rPr>
+        <w:t xml:space="preserve"> on an area page (Choose a topic, then an area; or Combine sections under More options), tick the box in the corner of any sections you want (or use the A to E buttons for a whole area, or All), and the three buttons at the top change to match, for example “Mixed: 3 sections”. Mixed, the AP Timed Spot Test and the AP Speed Challenge then use only the sections you ticked. Clear takes the ticks away. Clicking a section tile itself still opens just that one section.</w:t>
       </w:r>
     </w:p>
     <w:p>

</xml_diff>

<commit_message>
Approved Material home: mode cards like the A Level Topics home; guides updated
Co-Authored-By: Claude Sonnet 5.5 <noreply@anthropic.com>
Claude-Session: https://claude.ai/code/session_01S5rYTdm2Guhk5rucFAEyLg
</commit_message>
<xml_diff>
--- a/Word documents/AP_IGCSE_User_Guide.docx
+++ b/Word documents/AP_IGCSE_User_Guide.docx
@@ -18338,7 +18338,36 @@
           <w:sz w:val="24"/>
           <w:szCs w:val="24"/>
         </w:rPr>
-        <w:t xml:space="preserve">The home screen ("Ready to practise?")</w:t>
+        <w:t>The home screen ("What would you like to practise?")</w:t>
+      </w:r>
+    </w:p>
+    <w:p>
+      <w:pPr>
+        <w:pStyle w:val="ListParagraph"/>
+        <w:spacing w:after="70" w:line="276"/>
+      </w:pPr>
+      <w:r>
+        <w:rPr>
+          <w:rFonts w:ascii="Arial" w:cs="Arial" w:eastAsia="Arial" w:hAnsi="Arial"/>
+          <w:sz w:val="22"/>
+          <w:szCs w:val="22"/>
+        </w:rPr>
+        <w:t>Four cards: Approved Material (study first), Approved Material Studio (master it), Practice Sentences (then test yourself) and AP Speed Challenge. Press a card to open it. Approved Material and Practice Sentences open the set-up screen below, which has a ← Back button to return here. The Studio (you choose French, Italian or Spanish) has a ← Back to Approved Material button.</w:t>
+      </w:r>
+    </w:p>
+    <w:p>
+      <w:pPr>
+        <w:pStyle w:val="ListParagraph"/>
+        <w:spacing w:after="70" w:line="276"/>
+      </w:pPr>
+      <w:r>
+        <w:rPr>
+          <w:rFonts w:ascii="Arial" w:cs="Arial" w:eastAsia="Arial" w:hAnsi="Arial"/>
+          <w:b/>
+          <w:sz w:val="22"/>
+          <w:szCs w:val="22"/>
+        </w:rPr>
+        <w:t>The set-up screen ("Ready to practise?")</w:t>
       </w:r>
     </w:p>
     <w:p>
@@ -18356,79 +18385,71 @@
           <w:sz w:val="22"/>
           <w:szCs w:val="22"/>
         </w:rPr>
-        <w:t xml:space="preserve">At the top, three tiles: </w:t>
-      </w:r>
-      <w:r>
-        <w:rPr>
-          <w:rFonts w:ascii="Arial" w:cs="Arial" w:eastAsia="Arial" w:hAnsi="Arial"/>
-          <w:b/>
-          <w:bCs/>
-          <w:sz w:val="22"/>
-          <w:szCs w:val="22"/>
-        </w:rPr>
-        <w:t xml:space="preserve">1 📖 Approved Material (Study first)</w:t>
-      </w:r>
-      <w:r>
-        <w:rPr>
-          <w:rFonts w:ascii="Arial" w:cs="Arial" w:eastAsia="Arial" w:hAnsi="Arial"/>
-          <w:sz w:val="22"/>
-          <w:szCs w:val="22"/>
-        </w:rPr>
-        <w:t xml:space="preserve">, </w:t>
-      </w:r>
-      <w:r>
-        <w:rPr>
-          <w:rFonts w:ascii="Arial" w:cs="Arial" w:eastAsia="Arial" w:hAnsi="Arial"/>
-          <w:b/>
-          <w:bCs/>
-          <w:sz w:val="22"/>
-          <w:szCs w:val="22"/>
-        </w:rPr>
-        <w:t xml:space="preserve">2 🎓 Approved Material Studio (Master it, French)</w:t>
-      </w:r>
-      <w:r>
-        <w:rPr>
-          <w:rFonts w:ascii="Arial" w:cs="Arial" w:eastAsia="Arial" w:hAnsi="Arial"/>
-          <w:sz w:val="22"/>
-          <w:szCs w:val="22"/>
-        </w:rPr>
-        <w:t xml:space="preserve"> and </w:t>
-      </w:r>
-      <w:r>
-        <w:rPr>
-          <w:rFonts w:ascii="Arial" w:cs="Arial" w:eastAsia="Arial" w:hAnsi="Arial"/>
-          <w:b/>
-          <w:bCs/>
-          <w:sz w:val="22"/>
-          <w:szCs w:val="22"/>
-        </w:rPr>
-        <w:t xml:space="preserve">3 ✍️ Practice Sentences (Then test yourself)</w:t>
-      </w:r>
-      <w:r>
-        <w:rPr>
-          <w:rFonts w:ascii="Arial" w:cs="Arial" w:eastAsia="Arial" w:hAnsi="Arial"/>
-          <w:sz w:val="22"/>
-          <w:szCs w:val="22"/>
-        </w:rPr>
-        <w:t xml:space="preserve">. Tiles 1 and 3 switch what the rest of the home screen works on. Tile 2 opens the Studio (see below; you choose French, Italian or Spanish) and has a </w:t>
-      </w:r>
-      <w:r>
-        <w:rPr>
-          <w:rFonts w:ascii="Arial" w:cs="Arial" w:eastAsia="Arial" w:hAnsi="Arial"/>
-          <w:b/>
-          <w:bCs/>
-          <w:sz w:val="22"/>
-          <w:szCs w:val="22"/>
-        </w:rPr>
-        <w:t xml:space="preserve">← Back to Approved Material</w:t>
-      </w:r>
-      <w:r>
-        <w:rPr>
-          <w:rFonts w:ascii="Arial" w:cs="Arial" w:eastAsia="Arial" w:hAnsi="Arial"/>
-          <w:sz w:val="22"/>
-          <w:szCs w:val="22"/>
-        </w:rPr>
-        <w:t xml:space="preserve"> button.</w:t>
+        <w:t>Press ← Back at the top to return to the four cards.</w:t>
+      </w:r>
+      <w:r>
+        <w:rPr>
+          <w:rFonts w:ascii="Arial" w:cs="Arial" w:eastAsia="Arial" w:hAnsi="Arial"/>
+          <w:b/>
+          <w:bCs/>
+          <w:sz w:val="22"/>
+          <w:szCs w:val="22"/>
+        </w:rPr>
+      </w:r>
+      <w:r>
+        <w:rPr>
+          <w:rFonts w:ascii="Arial" w:cs="Arial" w:eastAsia="Arial" w:hAnsi="Arial"/>
+          <w:sz w:val="22"/>
+          <w:szCs w:val="22"/>
+        </w:rPr>
+      </w:r>
+      <w:r>
+        <w:rPr>
+          <w:rFonts w:ascii="Arial" w:cs="Arial" w:eastAsia="Arial" w:hAnsi="Arial"/>
+          <w:b/>
+          <w:bCs/>
+          <w:sz w:val="22"/>
+          <w:szCs w:val="22"/>
+        </w:rPr>
+      </w:r>
+      <w:r>
+        <w:rPr>
+          <w:rFonts w:ascii="Arial" w:cs="Arial" w:eastAsia="Arial" w:hAnsi="Arial"/>
+          <w:sz w:val="22"/>
+          <w:szCs w:val="22"/>
+        </w:rPr>
+      </w:r>
+      <w:r>
+        <w:rPr>
+          <w:rFonts w:ascii="Arial" w:cs="Arial" w:eastAsia="Arial" w:hAnsi="Arial"/>
+          <w:b/>
+          <w:bCs/>
+          <w:sz w:val="22"/>
+          <w:szCs w:val="22"/>
+        </w:rPr>
+      </w:r>
+      <w:r>
+        <w:rPr>
+          <w:rFonts w:ascii="Arial" w:cs="Arial" w:eastAsia="Arial" w:hAnsi="Arial"/>
+          <w:sz w:val="22"/>
+          <w:szCs w:val="22"/>
+        </w:rPr>
+      </w:r>
+      <w:r>
+        <w:rPr>
+          <w:rFonts w:ascii="Arial" w:cs="Arial" w:eastAsia="Arial" w:hAnsi="Arial"/>
+          <w:b/>
+          <w:bCs/>
+          <w:sz w:val="22"/>
+          <w:szCs w:val="22"/>
+        </w:rPr>
+      </w:r>
+      <w:r>
+        <w:rPr>
+          <w:rFonts w:ascii="Arial" w:cs="Arial" w:eastAsia="Arial" w:hAnsi="Arial"/>
+          <w:sz w:val="22"/>
+          <w:szCs w:val="22"/>
+        </w:rPr>
       </w:r>
     </w:p>
     <w:p>

</xml_diff>

<commit_message>
Studio: Combine tab (approved information built round AP Structures); guides updated
Co-Authored-By: Claude Sonnet 5.5 <noreply@anthropic.com>
Claude-Session: https://claude.ai/code/session_01S5rYTdm2Guhk5rucFAEyLg
</commit_message>
<xml_diff>
--- a/Word documents/AP_IGCSE_User_Guide.docx
+++ b/Word documents/AP_IGCSE_User_Guide.docx
@@ -19898,6 +19898,34 @@
           <w:szCs w:val="22"/>
         </w:rPr>
         <w:t xml:space="preserve"> the sentence is cut into groups of words. Click them in the right order, then Check. Click a word in the top box to take it back. The Studio tells you whether the order is exactly right.</w:t>
+      </w:r>
+    </w:p>
+    <w:p>
+      <w:pPr>
+        <w:pStyle w:val="ListParagraph"/>
+        <w:numPr>
+          <w:ilvl w:val="0"/>
+          <w:numId w:val="2"/>
+        </w:numPr>
+        <w:spacing w:after="60" w:line="276"/>
+      </w:pPr>
+      <w:r>
+        <w:rPr>
+          <w:rFonts w:ascii="Arial" w:cs="Arial" w:eastAsia="Arial" w:hAnsi="Arial"/>
+          <w:b/>
+          <w:bCs/>
+          <w:sz w:val="22"/>
+          <w:szCs w:val="22"/>
+        </w:rPr>
+        <w:t xml:space="preserve">Combine (approved material + AP Structures): </w:t>
+      </w:r>
+      <w:r>
+        <w:rPr>
+          <w:rFonts w:ascii="Arial" w:cs="Arial" w:eastAsia="Arial" w:hAnsi="Arial"/>
+          <w:sz w:val="22"/>
+          <w:szCs w:val="22"/>
+        </w:rPr>
+        <w:t>press the Combine tab on a topic. You get a series of challenges: each one pairs a point from the approved answer with an AP Structure, and you say aloud a sentence that gives that information built round that structure. Press Show the approved sentence to hear it and check the information, then Next. After the last challenge comes The whole answer: cover every point in order and use every AP Structure at least once, ticking each structure as you use it. Nothing is typed or scored.</w:t>
       </w:r>
     </w:p>
     <w:p>

</xml_diff>

<commit_message>
Picture machine goes full screen; no overlapping dots; full-screen top bar; red glowing rings in the demo; longer opening with language; guides updated
Co-Authored-By: Claude Sonnet 5.5 <noreply@anthropic.com>
Claude-Session: https://claude.ai/code/session_01S5rYTdm2Guhk5rucFAEyLg
</commit_message>
<xml_diff>
--- a/Word documents/AP_IGCSE_User_Guide.docx
+++ b/Word documents/AP_IGCSE_User_Guide.docx
@@ -19363,7 +19363,7 @@
           <w:sz w:val="22"/>
           <w:szCs w:val="22"/>
         </w:rPr>
-        <w:t>pick one of the five areas (A to E), then a section. Sections that have pictures open on the Pictures tab. Choose the topic from the list (topics in the same section can share one picture, each with its own numbers), then click the numbers on the picture: you hear the approved phrase in the language, and a second click on the same number shows and says it in English. ▶ Demo reads the topic’s approved sentences aloud while the matching numbers light up; press it again to stop. The full-screen button fills the screen for projecting. Above the picture, a line of Points to cover shows the points your answer needs, in order; tap a point to tick it off as you cover it, and during the Demo the current point lights up.</w:t>
+        <w:t>pick one of the five areas (A to E), then a section. Sections that have pictures open on the Pictures tab. Choose the topic from the list (topics in the same section can share one picture, each with its own numbers), then click the numbers on the picture: you hear the approved phrase in the language, and a second click on the same number shows and says it in English. ▶ Demo reads the topic’s approved sentences aloud while the matching numbers light up; press it again to stop. The full-screen button fills the screen for projecting; small buttons along the top let you hear the whole answer, switch the selected number to English, or leave full screen. Above the picture, a line of Points to cover shows the points your answer needs, in order; tap a point to tick it off as you cover it, and during the Demo the current point lights up and the numbers being spoken glow with a red ring.</w:t>
       </w:r>
       <w:r>
         <w:rPr>
@@ -19407,7 +19407,7 @@
           <w:sz w:val="22"/>
           <w:szCs w:val="22"/>
         </w:rPr>
-        <w:t>press Picture machine, choose which areas to draw from and press Set up the machine, then Spin. A random picture lands with a talk timer. Press Show to see the numbers and mark yourself OK or Near. Pictures do not repeat until all have been seen, and the tally is shown. The Back button goes back one stage at a time.</w:t>
+        <w:t>press Picture machine, choose which areas to draw from and press Set up the machine, then Spin. The machine goes full screen so the picture is as large as possible (press Esc, or the full-screen button, to come out). A random picture lands with a talk timer. Press Show to see the numbers and mark yourself OK or Near. Pictures do not repeat until all have been seen, and the tally is shown. The Back button goes back one stage at a time.</w:t>
       </w:r>
       <w:r>
         <w:rPr>

</xml_diff>

<commit_message>
Topic pages: AP Spot Test and Speed Challenge buttons for that topic on every exercise tab; guides updated
Co-Authored-By: Claude Sonnet 5.5 <noreply@anthropic.com>
Claude-Session: https://claude.ai/code/session_01S5rYTdm2Guhk5rucFAEyLg
</commit_message>
<xml_diff>
--- a/Word documents/AP_IGCSE_User_Guide.docx
+++ b/Word documents/AP_IGCSE_User_Guide.docx
@@ -19926,6 +19926,26 @@
           <w:szCs w:val="22"/>
         </w:rPr>
         <w:t>press the Combine tab on a topic. You get 14 challenges, one for each AP Structure. A coloured label tells you whether it is a Present, Past, Opinion or Future structure. Each challenge pairs a point from the approved answer with that structure, and you say aloud a sentence that gives that information built round the structure. Press Show the approved sentence to hear it and check the information; three example sentences with the structure then play and appear (press Play again to hear them again). Then press Next. After the last challenge comes The whole answer: cover every point in order and use every AP Structure at least once, ticking each structure (grouped as Present, Past, Opinion and Future) as you use it. Nothing is typed or scored. The challenges come in a different order each time you open a topic; press Another go for a fresh order.</w:t>
+      </w:r>
+    </w:p>
+    <w:p>
+      <w:pPr>
+        <w:pStyle w:val="ListParagraph"/>
+        <w:numPr>
+          <w:ilvl w:val="0"/>
+          <w:numId w:val="2"/>
+        </w:numPr>
+        <w:spacing w:after="60" w:line="276"/>
+      </w:pPr>
+      <w:r>
+        <w:rPr>
+          <w:rFonts w:ascii="Arial" w:cs="Arial" w:eastAsia="Arial" w:hAnsi="Arial"/>
+          <w:b/>
+          <w:bCs/>
+          <w:sz w:val="22"/>
+          <w:szCs w:val="22"/>
+        </w:rPr>
+        <w:t>Spot test and Speed Challenge: on any topic page, under the row of exercise buttons, there are two buttons: AP Spot Test for that topic and Speed Challenge for that topic. They stay there whichever exercise you are on.</w:t>
       </w:r>
     </w:p>
     <w:p>

</xml_diff>